<commit_message>
Extension A fight pass: furious dragon, warrior villagers, fire with real consequences, dynamic action camera
Co-Authored-By: Claude Opus 5.5 <noreply@anthropic.com>
Claude-Session: https://claude.ai/code/session_01YJE41d5btXjxgncsbRHMm3
</commit_message>
<xml_diff>
--- a/fableon/the-tide-mother/FABLEON-The-Tide-Mother-Extension-A.docx
+++ b/fableon/the-tide-mother/FABLEON-The-Tide-Mother-Extension-A.docx
@@ -160,7 +160,7 @@
         <w:t xml:space="preserve">L6 Bram's fishing shed</w:t>
       </w:r>
       <w:r>
-        <w:t xml:space="preserve">.</w:t>
+        <w:t xml:space="preserve">. Fight clips (A13–A18, A23–A26, A31, A33, A35) use a dynamic action camera and full battle performance; Tal's fire strikes wood and boats beside people but never kills anyone.</w:t>
       </w:r>
     </w:p>
     <w:p>
@@ -1428,7 +1428,7 @@
         <w:t xml:space="preserve">Image prompt:</w:t>
       </w:r>
       <w:r>
-        <w:t xml:space="preserve"> [ASPECT RATIO] 16:9 cinematic widescreen. [FRAMING &amp; LENS] WIDE SHOT from a low angle, 35mm anamorphic lens, cinematic framing, nothing cut off at the top or bottom; the characters are small in the frame, seen full-length from head to toe, each figure no taller than about one third of the frame height, with the setting filling most of the picture. [LIGHTING] Cinematic lighting at TRUE NIGHT under a black sky: orange pitch-torch light flickering against cold blue darkness, drifting harbor fog, volumetric torchlight haze, Rembrandt lighting sculpting the faces; faces are lit only by the nearest flame or glow and everything beyond it falls into black; no daylight anywhere. The torches are wooden staves with rag heads soaked in fish oil and pitch. [SUBJECT &amp; ACTION] On the LEFT, on the jetty, a crowd of villagers holding torches, gaffs and spears, with Bram at the front pointing; on the RIGHT, about 10 meters away, Tal standing in the shallows at the end of the jetty, wings half open, growling. CHARACTERS (keep exactly as described): Bram, a burly man about 40 with a scarred jaw, wet curly red-brown hair and a thick matted red-brown beard, wearing a heavy, shaggy, knee-length coat of worn brown and tan sheepskin fleece with a wide fleece collar, over a stained brown wool tunic with a wide leather belt, rough brown wool trousers and tall worn brown leather boots. villagers in real, everyday medieval northern fishing-village clothing in many different natural colours, every person dressed differently: layered hand-woven wool tunics, kirtles and hooded cloaks in undyed cream, oatmeal and sheep-grey, walnut brown, faded woad blue, mustard ochre and rust brown, with sheepskin vests, oiled leather jerkins, oilskin capes, wool hoods and caps, leather belts, leg-wraps and worn leather shoes; all colours muted, earthy and weathered, nothing bright; people of different heights and builds, faces under their hoods half in shadow. Tal, a fully grown adult sea dragon only about 6 feet (1.8 m) tall at the head, the size of a horse, not giant and not towering: standing on all four legs his head is level with a grown woman's head, and his body is about as long as a horse; slender and strong, with blush-pink and rose-white scales with a soft pearly sheen, large pale pink bat-like wings with faint violet veins, a crest of sharp spiky pink-white fin-frills on his head and neck, violet slit-pupil eyes, faint violet veins that glow softly, and an old brown wool scarf wrapped around his neck. Everyone is turned three-quarters toward the camera so every face is visible; nobody has their back to the camera and nobody looks into the lens. All mouths closed. Setting: the harbor of Kelvhaven, a medieval northern fishing village: an old wooden jetty on rough stone piers, wooden fishing boats moored on the black water, a square grey stone bell tower with a bronze bell at the harbor edge, wet stones, coils of rope, barrels and lobster pots. Early winter chill: a bitter wind, cold drizzle and sea mist, wet stone and mud, faint breath vapor in the cold air; no snow and no ice anywhere. [AESTHETIC STYLE] Photorealistic, shallow depth of field with cinematic bokeh, cinematic film still, dark fantasy, fine film grain, high-fidelity textures, desaturated high-contrast color grade, professional movie look. Palette: storm slate grey, fog grey, driftwood brown and wet-wool grey, with orange torchlight against cold blue. No text, no watermark, no modern objects.</w:t>
+        <w:t xml:space="preserve"> [ASPECT RATIO] 16:9 cinematic widescreen. [FRAMING &amp; LENS] WIDE SHOT from a very low angle, ground level, 35mm anamorphic lens, cinematic framing, nothing cut off at the top or bottom; the characters are small in the frame, seen full-length from head to toe, each figure no taller than about one third of the frame height, with the setting filling most of the picture. [LIGHTING] Cinematic lighting at TRUE NIGHT under a black sky: orange pitch-torch light flickering against cold blue darkness, drifting harbor fog, volumetric torchlight haze, Rembrandt lighting sculpting the faces; faces are lit only by the nearest flame or glow and everything beyond it falls into black; no daylight anywhere. The torches are wooden staves with rag heads soaked in fish oil and pitch. [SUBJECT &amp; ACTION] A battle face-off on the harbor: on the LEFT, on the jetty, a crowd of villagers with torches, spears, gaffs and harpoons, Bram at the front with a harpoon raised and his mouth open roaring an order; on the RIGHT, about 10 meters away, Tal standing in the shallows, chest low, head thrust forward. The villagers: the villagers as fierce, angry fighters, not bystanders: teeth bared, brows furrowed, faces twisted with rage and fear, mouths open in war cries, crouched in fighting stances, gripping spears, harpoons, gaffs and boat-hook poles, some holding round wooden shields and broken boat planks as cover, cloaks whipping, mud on their legs. The dragon: Tal in full fury, like a dragon in a great adventure film: snarling with his lips pulled back over rows of sharp white teeth, nostrils flared and steaming, his spiky pink-white crest raised and fanned out, wings mantled wide and high to make himself bigger, every muscle tense, claws gouging the ground, tail lashing, violet veins blazing bright, violet eyes narrowed to slits with rage. CHARACTERS (keep exactly as described): Bram, a burly man about 40 with a scarred jaw, wet curly red-brown hair and a thick matted red-brown beard, wearing a heavy, shaggy, knee-length coat of worn brown and tan sheepskin fleece with a wide fleece collar, over a stained brown wool tunic with a wide leather belt, rough brown wool trousers and tall worn brown leather boots. villagers in real, everyday medieval northern fishing-village clothing in many different natural colours, every person dressed differently: layered hand-woven wool tunics, kirtles and hooded cloaks in undyed cream, oatmeal and sheep-grey, walnut brown, faded woad blue, mustard ochre and rust brown, with sheepskin vests, oiled leather jerkins, oilskin capes, wool hoods and caps, leather belts, leg-wraps and worn leather shoes; all colours muted, earthy and weathered, nothing bright; people of different heights and builds, faces under their hoods half in shadow. Tal, a fully grown adult sea dragon only about 6 feet (1.8 m) tall at the head, the size of a horse, not giant and not towering: standing on all four legs his head is level with a grown woman's head, and his body is about as long as a horse; slender and strong, with blush-pink and rose-white scales with a soft pearly sheen, large pale pink bat-like wings with faint violet veins, a crest of sharp spiky pink-white fin-frills on his head and neck, violet slit-pupil eyes, faint violet veins that glow softly, and an old brown wool scarf wrapped around his neck. Everyone is turned three-quarters toward the camera so every face is visible; nobody has their back to the camera and nobody looks into the lens. All mouths closed. Setting: the harbor of Kelvhaven, a medieval northern fishing village: an old wooden jetty on rough stone piers, wooden fishing boats moored on the black water, a square grey stone bell tower with a bronze bell at the harbor edge, wet stones, coils of rope, barrels and lobster pots. Early winter chill: a bitter wind, cold drizzle and sea mist, wet stone and mud, faint breath vapor in the cold air; no snow and no ice anywhere. [AESTHETIC STYLE] Photorealistic, shallow depth of field with cinematic bokeh, cinematic film still, dark fantasy, fine film grain, high-fidelity textures, desaturated high-contrast color grade, professional movie look. Palette: storm slate grey, fog grey, driftwood brown and wet-wool grey, with orange torchlight against cold blue. No text, no watermark, no modern objects.</w:t>
       </w:r>
     </w:p>
     <w:p>
@@ -1448,7 +1448,7 @@
         <w:t xml:space="preserve">Video prompt (10 s):</w:t>
       </w:r>
       <w:r>
-        <w:t xml:space="preserve"> 10-second cinematic shot, 16:9, photorealistic dark fantasy, desaturated high-contrast grade, animate from the uploaded image. 0–3s: tense silence; torches flicker. 3–7s: SPEAKER: Bram, the burly man in the shaggy sheepskin coat, face three-quarters to the camera, eyes on the dragon. Bram says: "There it is! Get the harpoons!" 7–10s: men run back along the jetty toward the harpoon rack. RULES: only Bram speaks, one voice only (Bram's voice: a man about 40: a very deep, rough, gravelly American voice, loud, hard and sneering, with short clipped words); the voice is dry, clear and close to the microphone, with no echo and no reverb; everyone else keeps their mouth closed. Nobody looks into the camera lens and nobody turns their back to the camera. Camera: completely static, locked off on a tripod; no zoom; all motion comes from the characters, the wind, the water and the light. Early winter chill: wind tugs at hair and cloaks, light drizzle, breath vapor; no snow, no ice. Lighting stays: orange pitch-torch light flickering against cold blue darkness, drifting harbor fog, volumetric torchlight haze, Rembrandt lighting sculpting the faces; faces are lit only by the nearest flame or glow and everything beyond it falls into black; no daylight anywhere. The torches are wooden staves with rag heads soaked in fish oil and pitch. Mood: menace. Sound: crackling pitch torches, wind, waves slapping the jetty, Tal's low growl. Keep every face, costume and the dragon's design exactly as in the image; Tal stays horse-sized and blush-pink with violet eyes and his brown wool scarf; smooth, natural, physically real motion; no on-screen text.</w:t>
+        <w:t xml:space="preserve"> 10-second cinematic shot, 16:9, photorealistic dark fantasy, desaturated high-contrast grade, animate from the uploaded image. 0–3s: Tal lets out a deafening roar at the crowd, spit and steam flying from his jaws, wings snapping open; the front villagers flinch but hold, snarling back. 3–7s: SPEAKER: Bram, the burly man in the shaggy sheepskin coat, roaring with fury, face three-quarters to the camera, eyes on the dragon. Bram says: "There it is! Get the harpoons!" 7–10s: the men behind him bellow a war cry and surge forward along the jetty, weapons up. RULES: only Bram speaks, one voice only (Bram's voice: a man about 40: a very deep, rough, gravelly American voice, loud, hard and sneering, with short clipped words); the voice is dry, clear and close to the microphone, with no echo and no reverb; everyone else keeps their mouth closed. Nobody looks into the camera lens and nobody turns their back to the camera. Camera: dynamic action camera, like a big-budget dragon battle film: handheld with a slight combat shake, starting low and wide, then a fast push-in toward Tal's snarling face as he roars; the impact of each roar and blow shakes the camera; no cuts. Early winter chill: wind tugs at hair and cloaks, light drizzle, breath vapor; no snow, no ice. Lighting stays: orange pitch-torch light flickering against cold blue darkness, drifting harbor fog, volumetric torchlight haze, Rembrandt lighting sculpting the faces; faces are lit only by the nearest flame or glow and everything beyond it falls into black; no daylight anywhere. The torches are wooden staves with rag heads soaked in fish oil and pitch. Mood: fury. Sound: a deafening dragon roar, a crowd war cry, crackling torches, waves. PERFORMANCE: everyone acts with real intensity: the villagers shout, snarl and fight like warriors defending their homes; Tal fights like a furious dragon (snarling, snapping, roaring with spit flying, crest flared, wings mantled, tail lashing). Keep every face, costume and the dragon's design exactly as in the image; Tal stays horse-sized and blush-pink with violet eyes and his brown wool scarf; smooth, natural, physically real motion; no on-screen text.</w:t>
       </w:r>
     </w:p>
     <w:p>
@@ -1526,7 +1526,7 @@
         <w:t xml:space="preserve">Image prompt:</w:t>
       </w:r>
       <w:r>
-        <w:t xml:space="preserve"> [ASPECT RATIO] 16:9 cinematic widescreen. [FRAMING &amp; LENS] WIDE SHOT from a low angle, 35mm anamorphic lens, cinematic framing, nothing cut off at the top or bottom; the characters are small in the frame, seen full-length from head to toe, each figure no taller than about one third of the frame height, with the setting filling most of the picture. [LIGHTING] Cinematic lighting at TRUE NIGHT under a black sky: orange pitch-torch light flickering against cold blue darkness, drifting harbor fog, volumetric torchlight haze, Rembrandt lighting sculpting the faces; faces are lit only by the nearest flame or glow and everything beyond it falls into black; no daylight anywhere. The torches are wooden staves with rag heads soaked in fish oil and pitch. [SUBJECT &amp; ACTION] On the LEFT, three villagers on the jetty with their arms drawn back mid-throw, spears and gaffs in their hands; on the RIGHT, Tal in the shallows, wings half open. CHARACTERS (keep exactly as described): villagers in real, everyday medieval northern fishing-village clothing in many different natural colours, every person dressed differently: layered hand-woven wool tunics, kirtles and hooded cloaks in undyed cream, oatmeal and sheep-grey, walnut brown, faded woad blue, mustard ochre and rust brown, with sheepskin vests, oiled leather jerkins, oilskin capes, wool hoods and caps, leather belts, leg-wraps and worn leather shoes; all colours muted, earthy and weathered, nothing bright; people of different heights and builds, faces under their hoods half in shadow. Tal, a fully grown adult sea dragon only about 6 feet (1.8 m) tall at the head, the size of a horse, not giant and not towering: standing on all four legs his head is level with a grown woman's head, and his body is about as long as a horse; slender and strong, with blush-pink and rose-white scales with a soft pearly sheen, large pale pink bat-like wings with faint violet veins, a crest of sharp spiky pink-white fin-frills on his head and neck, violet slit-pupil eyes, faint violet veins that glow softly, and an old brown wool scarf wrapped around his neck. VISIBLE STATE, must be clearly shown: the spears still in the men's hands. Everyone is turned three-quarters toward the camera so every face is visible; nobody has their back to the camera and nobody looks into the lens. All mouths closed. Setting: the harbor of Kelvhaven, a medieval northern fishing village: an old wooden jetty on rough stone piers, wooden fishing boats moored on the black water, a square grey stone bell tower with a bronze bell at the harbor edge, wet stones, coils of rope, barrels and lobster pots. Early winter chill: a bitter wind, cold drizzle and sea mist, wet stone and mud, faint breath vapor in the cold air; no snow and no ice anywhere. [AESTHETIC STYLE] Photorealistic, shallow depth of field with cinematic bokeh, cinematic film still, dark fantasy, fine film grain, high-fidelity textures, desaturated high-contrast color grade, professional movie look. Palette: storm slate grey, fog grey, driftwood brown and wet-wool grey, with orange torchlight against cold blue. No text, no watermark, no modern objects.</w:t>
+        <w:t xml:space="preserve"> [ASPECT RATIO] 16:9 cinematic widescreen. [FRAMING &amp; LENS] MEDIUM WIDE SHOT from a low angle, 35mm anamorphic lens, cinematic framing, nothing cut off at the top or bottom; figures seen full-length, each no taller than about half of the frame height, the surroundings clearly visible. [LIGHTING] Cinematic lighting at TRUE NIGHT under a black sky: orange pitch-torch light flickering against cold blue darkness, drifting harbor fog, volumetric torchlight haze, Rembrandt lighting sculpting the faces; faces are lit only by the nearest flame or glow and everything beyond it falls into black; no daylight anywhere. The torches are wooden staves with rag heads soaked in fish oil and pitch. [SUBJECT &amp; ACTION] Mid-battle on the jetty: on the LEFT, villagers charging forward, three men with arms drawn back mid-throw, spears and gaffs in their hands, roaring; on the RIGHT, Tal rising in the shallows to meet them. The villagers: the villagers as fierce, angry fighters, not bystanders: teeth bared, brows furrowed, faces twisted with rage and fear, mouths open in war cries, crouched in fighting stances, gripping spears, harpoons, gaffs and boat-hook poles, some holding round wooden shields and broken boat planks as cover, cloaks whipping, mud on their legs. The dragon: Tal in full fury, like a dragon in a great adventure film: snarling with his lips pulled back over rows of sharp white teeth, nostrils flared and steaming, his spiky pink-white crest raised and fanned out, wings mantled wide and high to make himself bigger, every muscle tense, claws gouging the ground, tail lashing, violet veins blazing bright, violet eyes narrowed to slits with rage. CHARACTERS (keep exactly as described): villagers in real, everyday medieval northern fishing-village clothing in many different natural colours, every person dressed differently: layered hand-woven wool tunics, kirtles and hooded cloaks in undyed cream, oatmeal and sheep-grey, walnut brown, faded woad blue, mustard ochre and rust brown, with sheepskin vests, oiled leather jerkins, oilskin capes, wool hoods and caps, leather belts, leg-wraps and worn leather shoes; all colours muted, earthy and weathered, nothing bright; people of different heights and builds, faces under their hoods half in shadow. Tal, a fully grown adult sea dragon only about 6 feet (1.8 m) tall at the head, the size of a horse, not giant and not towering: standing on all four legs his head is level with a grown woman's head, and his body is about as long as a horse; slender and strong, with blush-pink and rose-white scales with a soft pearly sheen, large pale pink bat-like wings with faint violet veins, a crest of sharp spiky pink-white fin-frills on his head and neck, violet slit-pupil eyes, faint violet veins that glow softly, and an old brown wool scarf wrapped around his neck. VISIBLE STATE, must be clearly shown: the spears still in the men's hands. Everyone is turned three-quarters toward the camera so every face is visible; nobody has their back to the camera and nobody looks into the lens. All mouths closed. Setting: the harbor of Kelvhaven, a medieval northern fishing village: an old wooden jetty on rough stone piers, wooden fishing boats moored on the black water, a square grey stone bell tower with a bronze bell at the harbor edge, wet stones, coils of rope, barrels and lobster pots. Early winter chill: a bitter wind, cold drizzle and sea mist, wet stone and mud, faint breath vapor in the cold air; no snow and no ice anywhere. [AESTHETIC STYLE] Photorealistic, shallow depth of field with cinematic bokeh, cinematic film still, dark fantasy, fine film grain, high-fidelity textures, desaturated high-contrast color grade, professional movie look. Palette: storm slate grey, fog grey, driftwood brown and wet-wool grey, with orange torchlight against cold blue. No text, no watermark, no modern objects.</w:t>
       </w:r>
     </w:p>
     <w:p>
@@ -1546,7 +1546,7 @@
         <w:t xml:space="preserve">Video prompt (10 s):</w:t>
       </w:r>
       <w:r>
-        <w:t xml:space="preserve"> 10-second cinematic shot, 16:9, photorealistic dark fantasy, desaturated high-contrast grade, animate from the uploaded image. 0–4s: the men hurl the spears. 4–10s: the spears clatter off Tal's pearly scales with tiny sparks and fall into the water; Tal flinches and roars. RULES: no one speaks; no dialogue. Nobody looks into the camera lens and nobody turns their back to the camera. Camera: completely static, locked off on a tripod; no zoom; all motion comes from the characters, the wind, the water and the light. Early winter chill: wind tugs at hair and cloaks, light drizzle, breath vapor; no snow, no ice. Lighting stays: orange pitch-torch light flickering against cold blue darkness, drifting harbor fog, volumetric torchlight haze, Rembrandt lighting sculpting the faces; faces are lit only by the nearest flame or glow and everything beyond it falls into black; no daylight anywhere. The torches are wooden staves with rag heads soaked in fish oil and pitch. Mood: violent. Sound: spears clattering, a roar, shouts. Keep every face, costume and the dragon's design exactly as in the image; Tal stays horse-sized and blush-pink with violet eyes and his brown wool scarf; smooth, natural, physically real motion; no on-screen text.</w:t>
+        <w:t xml:space="preserve"> 10-second cinematic shot, 16:9, photorealistic dark fantasy, desaturated high-contrast grade, animate from the uploaded image. 0–3s: the men hurl the spears with a shout. 3–6s: the spears clatter off Tal's pearly scales with sparks; one lodges in a gap at his shoulder plate; he snaps the shaft off with his jaws. 6–10s: Tal snarls, steam pouring from his nostrils, and lunges forward with a snapping bite that stops just short of the jetty; the men scramble back, still shouting. RULES: no spoken lines; only wordless shouts, war cries, grunts and roars. Nobody looks into the camera lens and nobody turns their back to the camera. Camera: dynamic action camera, like a big-budget dragon battle film: handheld with a slight combat shake, a whip pan following the spears from the men to the dragon, then a quick push-in on Tal's snapping jaws; the impact of each roar and blow shakes the camera; no cuts. Early winter chill: wind tugs at hair and cloaks, light drizzle, breath vapor; no snow, no ice. Lighting stays: orange pitch-torch light flickering against cold blue darkness, drifting harbor fog, volumetric torchlight haze, Rembrandt lighting sculpting the faces; faces are lit only by the nearest flame or glow and everything beyond it falls into black; no daylight anywhere. The torches are wooden staves with rag heads soaked in fish oil and pitch. Mood: fury. Sound: spears clattering, a snapping bite, roars, war cries. PERFORMANCE: everyone acts with real intensity: the villagers shout, snarl and fight like warriors defending their homes; Tal fights like a furious dragon (snarling, snapping, roaring with spit flying, crest flared, wings mantled, tail lashing). Keep every face, costume and the dragon's design exactly as in the image; Tal stays horse-sized and blush-pink with violet eyes and his brown wool scarf; smooth, natural, physically real motion; no on-screen text.</w:t>
       </w:r>
     </w:p>
     <w:p>
@@ -1624,7 +1624,7 @@
         <w:t xml:space="preserve">Image prompt:</w:t>
       </w:r>
       <w:r>
-        <w:t xml:space="preserve"> [ASPECT RATIO] 16:9 cinematic widescreen. [FRAMING &amp; LENS] WIDE SHOT from a low angle, 35mm anamorphic lens, cinematic framing, nothing cut off at the top or bottom; the characters are small in the frame, seen full-length from head to toe, each figure no taller than about one third of the frame height, with the setting filling most of the picture. [LIGHTING] Cinematic lighting at TRUE NIGHT under a black sky: orange pitch-torch light flickering against cold blue darkness, drifting harbor fog, volumetric torchlight haze, Rembrandt lighting sculpting the faces; faces are lit only by the nearest flame or glow and everything beyond it falls into black; no daylight anywhere. The torches are wooden staves with rag heads soaked in fish oil and pitch. [SUBJECT &amp; ACTION] Tal rearing up in the shallows, wings spread, his tail raised high above a moored wooden fishing boat, furious. CHARACTERS (keep exactly as described): Tal, a fully grown adult sea dragon only about 6 feet (1.8 m) tall at the head, the size of a horse, not giant and not towering: standing on all four legs his head is level with a grown woman's head, and his body is about as long as a horse; slender and strong, with blush-pink and rose-white scales with a soft pearly sheen, large pale pink bat-like wings with faint violet veins, a crest of sharp spiky pink-white fin-frills on his head and neck, violet slit-pupil eyes, faint violet veins that glow softly, and an old brown wool scarf wrapped around his neck. VISIBLE STATE, must be clearly shown: the boat still whole. Everyone is turned three-quarters toward the camera so every face is visible; nobody has their back to the camera and nobody looks into the lens. All mouths closed. Setting: the harbor of Kelvhaven, a medieval northern fishing village: an old wooden jetty on rough stone piers, wooden fishing boats moored on the black water, a square grey stone bell tower with a bronze bell at the harbor edge, wet stones, coils of rope, barrels and lobster pots. Early winter chill: a bitter wind, cold drizzle and sea mist, wet stone and mud, faint breath vapor in the cold air; no snow and no ice anywhere. [AESTHETIC STYLE] Photorealistic, shallow depth of field with cinematic bokeh, cinematic film still, dark fantasy, fine film grain, high-fidelity textures, desaturated high-contrast color grade, professional movie look. Palette: storm slate grey, fog grey, driftwood brown and wet-wool grey, with orange torchlight against cold blue. No text, no watermark, no modern objects.</w:t>
+        <w:t xml:space="preserve"> [ASPECT RATIO] 16:9 cinematic widescreen. [FRAMING &amp; LENS] WIDE SHOT from a low angle, 35mm anamorphic lens, cinematic framing, nothing cut off at the top or bottom; the characters are small in the frame, seen full-length from head to toe, each figure no taller than about one third of the frame height, with the setting filling most of the picture. [LIGHTING] Cinematic lighting at TRUE NIGHT under a black sky: orange pitch-torch light flickering against cold blue darkness, drifting harbor fog, volumetric torchlight haze, Rembrandt lighting sculpting the faces; faces are lit only by the nearest flame or glow and everything beyond it falls into black; no daylight anywhere. The torches are wooden staves with rag heads soaked in fish oil and pitch. [SUBJECT &amp; ACTION] Tal rearing up in the shallows, wings spread wide, tail raised high above a moored wooden fishing boat; on the LEFT, men in a small rowing boat nearby, raising boat hooks and shouting. The dragon: Tal in full fury, like a dragon in a great adventure film: snarling with his lips pulled back over rows of sharp white teeth, nostrils flared and steaming, his spiky pink-white crest raised and fanned out, wings mantled wide and high to make himself bigger, every muscle tense, claws gouging the ground, tail lashing, violet veins blazing bright, violet eyes narrowed to slits with rage. CHARACTERS (keep exactly as described): Tal, a fully grown adult sea dragon only about 6 feet (1.8 m) tall at the head, the size of a horse, not giant and not towering: standing on all four legs his head is level with a grown woman's head, and his body is about as long as a horse; slender and strong, with blush-pink and rose-white scales with a soft pearly sheen, large pale pink bat-like wings with faint violet veins, a crest of sharp spiky pink-white fin-frills on his head and neck, violet slit-pupil eyes, faint violet veins that glow softly, and an old brown wool scarf wrapped around his neck. villagers in real, everyday medieval northern fishing-village clothing in many different natural colours, every person dressed differently: layered hand-woven wool tunics, kirtles and hooded cloaks in undyed cream, oatmeal and sheep-grey, walnut brown, faded woad blue, mustard ochre and rust brown, with sheepskin vests, oiled leather jerkins, oilskin capes, wool hoods and caps, leather belts, leg-wraps and worn leather shoes; all colours muted, earthy and weathered, nothing bright; people of different heights and builds, faces under their hoods half in shadow. VISIBLE STATE, must be clearly shown: the moored boat still whole. Everyone is turned three-quarters toward the camera so every face is visible; nobody has their back to the camera and nobody looks into the lens. All mouths closed. Setting: the harbor of Kelvhaven, a medieval northern fishing village: an old wooden jetty on rough stone piers, wooden fishing boats moored on the black water, a square grey stone bell tower with a bronze bell at the harbor edge, wet stones, coils of rope, barrels and lobster pots. Early winter chill: a bitter wind, cold drizzle and sea mist, wet stone and mud, faint breath vapor in the cold air; no snow and no ice anywhere. [AESTHETIC STYLE] Photorealistic, shallow depth of field with cinematic bokeh, cinematic film still, dark fantasy, fine film grain, high-fidelity textures, desaturated high-contrast color grade, professional movie look. Palette: storm slate grey, fog grey, driftwood brown and wet-wool grey, with orange torchlight against cold blue. No text, no watermark, no modern objects.</w:t>
       </w:r>
     </w:p>
     <w:p>
@@ -1644,7 +1644,7 @@
         <w:t xml:space="preserve">Video prompt (10 s):</w:t>
       </w:r>
       <w:r>
-        <w:t xml:space="preserve"> 10-second cinematic shot, 16:9, photorealistic dark fantasy, desaturated high-contrast grade, animate from the uploaded image. 0–4s: Tal brings his tail down and smashes the boat into splinters in a burst of water and wood. 4–10s: he swings around and cracks the side of a second boat. RULES: no one speaks; no dialogue. Nobody looks into the camera lens and nobody turns their back to the camera. Camera: completely static, locked off on a tripod; no zoom; all motion comes from the characters, the wind, the water and the light. Early winter chill: wind tugs at hair and cloaks, light drizzle, breath vapor; no snow, no ice. Lighting stays: orange pitch-torch light flickering against cold blue darkness, drifting harbor fog, volumetric torchlight haze, Rembrandt lighting sculpting the faces; faces are lit only by the nearest flame or glow and everything beyond it falls into black; no daylight anywhere. The torches are wooden staves with rag heads soaked in fish oil and pitch. Mood: violent. Sound: wood splintering, a roar, distant screams. Keep every face, costume and the dragon's design exactly as in the image; Tal stays horse-sized and blush-pink with violet eyes and his brown wool scarf; smooth, natural, physically real motion; no on-screen text.</w:t>
+        <w:t xml:space="preserve"> 10-second cinematic shot, 16:9, photorealistic dark fantasy, desaturated high-contrast grade, animate from the uploaded image. 0–4s: Tal brings his tail down like a hammer and smashes the boat into splinters in a burst of water and wood; planks fly past the men, who duck and shield their heads. 4–10s: he turns and rams a second boat with his shoulder, cracking its side; the men in the rowing boat are thrown into the water and swim for the jetty, shouting. RULES: no spoken lines; only wordless shouts, war cries, grunts and roars. Nobody looks into the camera lens and nobody turns their back to the camera. Camera: dynamic action camera, like a big-budget dragon battle film: handheld with a slight combat shake, low and wide at water level; the camera is hit by spray and shakes with the impact; the impact of each roar and blow shakes the camera; no cuts. Early winter chill: wind tugs at hair and cloaks, light drizzle, breath vapor; no snow, no ice. Lighting stays: orange pitch-torch light flickering against cold blue darkness, drifting harbor fog, volumetric torchlight haze, Rembrandt lighting sculpting the faces; faces are lit only by the nearest flame or glow and everything beyond it falls into black; no daylight anywhere. The torches are wooden staves with rag heads soaked in fish oil and pitch. Mood: fury. Sound: wood exploding, a roar, splashing, shouts. PERFORMANCE: everyone acts with real intensity: the villagers shout, snarl and fight like warriors defending their homes; Tal fights like a furious dragon (snarling, snapping, roaring with spit flying, crest flared, wings mantled, tail lashing). Keep every face, costume and the dragon's design exactly as in the image; Tal stays horse-sized and blush-pink with violet eyes and his brown wool scarf; smooth, natural, physically real motion; no on-screen text.</w:t>
       </w:r>
     </w:p>
     <w:p>
@@ -1722,7 +1722,7 @@
         <w:t xml:space="preserve">Image prompt:</w:t>
       </w:r>
       <w:r>
-        <w:t xml:space="preserve"> [ASPECT RATIO] 16:9 cinematic widescreen. [FRAMING &amp; LENS] WIDE SHOT from a low angle, 35mm anamorphic lens, cinematic framing, nothing cut off at the top or bottom; the characters are small in the frame, seen full-length from head to toe, each figure no taller than about one third of the frame height, with the setting filling most of the picture. [LIGHTING] Cinematic lighting at TRUE NIGHT under a black sky: orange pitch-torch light flickering against cold blue darkness, drifting harbor fog, volumetric torchlight haze, Rembrandt lighting sculpting the faces; faces are lit only by the nearest flame or glow and everything beyond it falls into black; no daylight anywhere. The torches are wooden staves with rag heads soaked in fish oil and pitch. [SUBJECT &amp; ACTION] Tal with one clawed front foot on the end of the wooden jetty, climbing up, the planks cracking; on the LEFT, villagers stumbling backward with torches. CHARACTERS (keep exactly as described): Tal, a fully grown adult sea dragon only about 6 feet (1.8 m) tall at the head, the size of a horse, not giant and not towering: standing on all four legs his head is level with a grown woman's head, and his body is about as long as a horse; slender and strong, with blush-pink and rose-white scales with a soft pearly sheen, large pale pink bat-like wings with faint violet veins, a crest of sharp spiky pink-white fin-frills on his head and neck, violet slit-pupil eyes, faint violet veins that glow softly, and an old brown wool scarf wrapped around his neck. villagers in real, everyday medieval northern fishing-village clothing in many different natural colours, every person dressed differently: layered hand-woven wool tunics, kirtles and hooded cloaks in undyed cream, oatmeal and sheep-grey, walnut brown, faded woad blue, mustard ochre and rust brown, with sheepskin vests, oiled leather jerkins, oilskin capes, wool hoods and caps, leather belts, leg-wraps and worn leather shoes; all colours muted, earthy and weathered, nothing bright; people of different heights and builds, faces under their hoods half in shadow. Everyone is turned three-quarters toward the camera so every face is visible; nobody has their back to the camera and nobody looks into the lens. All mouths closed. Setting: the harbor of Kelvhaven, a medieval northern fishing village: an old wooden jetty on rough stone piers, wooden fishing boats moored on the black water, a square grey stone bell tower with a bronze bell at the harbor edge, wet stones, coils of rope, barrels and lobster pots. Early winter chill: a bitter wind, cold drizzle and sea mist, wet stone and mud, faint breath vapor in the cold air; no snow and no ice anywhere. [AESTHETIC STYLE] Photorealistic, shallow depth of field with cinematic bokeh, cinematic film still, dark fantasy, fine film grain, high-fidelity textures, desaturated high-contrast color grade, professional movie look. Palette: storm slate grey, fog grey, driftwood brown and wet-wool grey, with orange torchlight against cold blue. No text, no watermark, no modern objects.</w:t>
+        <w:t xml:space="preserve"> [ASPECT RATIO] 16:9 cinematic widescreen. [FRAMING &amp; LENS] WIDE SHOT from a very low angle, ground level on the jetty, 35mm anamorphic lens, cinematic framing, nothing cut off at the top or bottom; the characters are small in the frame, seen full-length from head to toe, each figure no taller than about one third of the frame height, with the setting filling most of the picture. [LIGHTING] Cinematic lighting at TRUE NIGHT under a black sky: orange pitch-torch light flickering against cold blue darkness, drifting harbor fog, volumetric torchlight haze, Rembrandt lighting sculpting the faces; faces are lit only by the nearest flame or glow and everything beyond it falls into black; no daylight anywhere. The torches are wooden staves with rag heads soaked in fish oil and pitch. [SUBJECT &amp; ACTION] Tal hauling himself up onto the end of the wooden jetty, one clawed foot on the planks, wings spread, jaws open in a roar; on the LEFT, villagers forming a ragged line with spears and planks as shields, braced to fight. The villagers: the villagers as fierce, angry fighters, not bystanders: teeth bared, brows furrowed, faces twisted with rage and fear, mouths open in war cries, crouched in fighting stances, gripping spears, harpoons, gaffs and boat-hook poles, some holding round wooden shields and broken boat planks as cover, cloaks whipping, mud on their legs. The dragon: Tal in full fury, like a dragon in a great adventure film: snarling with his lips pulled back over rows of sharp white teeth, nostrils flared and steaming, his spiky pink-white crest raised and fanned out, wings mantled wide and high to make himself bigger, every muscle tense, claws gouging the ground, tail lashing, violet veins blazing bright, violet eyes narrowed to slits with rage. CHARACTERS (keep exactly as described): Tal, a fully grown adult sea dragon only about 6 feet (1.8 m) tall at the head, the size of a horse, not giant and not towering: standing on all four legs his head is level with a grown woman's head, and his body is about as long as a horse; slender and strong, with blush-pink and rose-white scales with a soft pearly sheen, large pale pink bat-like wings with faint violet veins, a crest of sharp spiky pink-white fin-frills on his head and neck, violet slit-pupil eyes, faint violet veins that glow softly, and an old brown wool scarf wrapped around his neck. villagers in real, everyday medieval northern fishing-village clothing in many different natural colours, every person dressed differently: layered hand-woven wool tunics, kirtles and hooded cloaks in undyed cream, oatmeal and sheep-grey, walnut brown, faded woad blue, mustard ochre and rust brown, with sheepskin vests, oiled leather jerkins, oilskin capes, wool hoods and caps, leather belts, leg-wraps and worn leather shoes; all colours muted, earthy and weathered, nothing bright; people of different heights and builds, faces under their hoods half in shadow. Everyone is turned three-quarters toward the camera so every face is visible; nobody has their back to the camera and nobody looks into the lens. All mouths closed. Setting: the harbor of Kelvhaven, a medieval northern fishing village: an old wooden jetty on rough stone piers, wooden fishing boats moored on the black water, a square grey stone bell tower with a bronze bell at the harbor edge, wet stones, coils of rope, barrels and lobster pots. Early winter chill: a bitter wind, cold drizzle and sea mist, wet stone and mud, faint breath vapor in the cold air; no snow and no ice anywhere. [AESTHETIC STYLE] Photorealistic, shallow depth of field with cinematic bokeh, cinematic film still, dark fantasy, fine film grain, high-fidelity textures, desaturated high-contrast color grade, professional movie look. Palette: storm slate grey, fog grey, driftwood brown and wet-wool grey, with orange torchlight against cold blue. No text, no watermark, no modern objects.</w:t>
       </w:r>
     </w:p>
     <w:p>
@@ -1742,7 +1742,7 @@
         <w:t xml:space="preserve">Video prompt (10 s):</w:t>
       </w:r>
       <w:r>
-        <w:t xml:space="preserve"> 10-second cinematic shot, 16:9, photorealistic dark fantasy, desaturated high-contrast grade, animate from the uploaded image. 0–5s: Tal hauls himself up onto the jetty; the planks crack and sag. 5–10s: the villagers scatter and run, each a different way, dropping torches that hiss in the puddles. RULES: no one speaks; no dialogue. Nobody looks into the camera lens and nobody turns their back to the camera. Camera: one slow, smooth pan following Tal; no zoom. Early winter chill: wind tugs at hair and cloaks, light drizzle, breath vapor; no snow, no ice. Lighting stays: orange pitch-torch light flickering against cold blue darkness, drifting harbor fog, volumetric torchlight haze, Rembrandt lighting sculpting the faces; faces are lit only by the nearest flame or glow and everything beyond it falls into black; no daylight anywhere. The torches are wooden staves with rag heads soaked in fish oil and pitch. Mood: chaos. Sound: cracking planks, screams, hissing torches. Keep every face, costume and the dragon's design exactly as in the image; Tal stays horse-sized and blush-pink with violet eyes and his brown wool scarf; smooth, natural, physically real motion; no on-screen text.</w:t>
+        <w:t xml:space="preserve"> 10-second cinematic shot, 16:9, photorealistic dark fantasy, desaturated high-contrast grade, animate from the uploaded image. 0–4s: Tal heaves himself onto the jetty; the planks crack and sag under his weight. 4–7s: the line of men charges him with spears and a war cry; Tal swats two spears aside with a wing. 7–10s: he roars in their faces; the line breaks and the men fall back, some slipping on the wet planks, dropping torches that hiss in the puddles. RULES: no spoken lines; only wordless shouts, war cries, grunts and roars. Nobody looks into the camera lens and nobody turns their back to the camera. Camera: dynamic action camera, like a big-budget dragon battle film: handheld with a slight combat shake, a low tracking shot moving backward along the jetty ahead of the charging men, then tilting up at the roaring dragon; the impact of each roar and blow shakes the camera; no cuts. Early winter chill: wind tugs at hair and cloaks, light drizzle, breath vapor; no snow, no ice. Lighting stays: orange pitch-torch light flickering against cold blue darkness, drifting harbor fog, volumetric torchlight haze, Rembrandt lighting sculpting the faces; faces are lit only by the nearest flame or glow and everything beyond it falls into black; no daylight anywhere. The torches are wooden staves with rag heads soaked in fish oil and pitch. Mood: fury. Sound: cracking planks, a war cry, a roar, hissing torches. PERFORMANCE: everyone acts with real intensity: the villagers shout, snarl and fight like warriors defending their homes; Tal fights like a furious dragon (snarling, snapping, roaring with spit flying, crest flared, wings mantled, tail lashing). Keep every face, costume and the dragon's design exactly as in the image; Tal stays horse-sized and blush-pink with violet eyes and his brown wool scarf; smooth, natural, physically real motion; no on-screen text.</w:t>
       </w:r>
     </w:p>
     <w:p>
@@ -1820,7 +1820,7 @@
         <w:t xml:space="preserve">Image prompt:</w:t>
       </w:r>
       <w:r>
-        <w:t xml:space="preserve"> [ASPECT RATIO] 16:9 cinematic widescreen. [FRAMING &amp; LENS] MEDIUM WIDE SHOT at eye level, 35mm anamorphic lens, cinematic framing, nothing cut off at the top or bottom; figures seen full-length, each no taller than about half of the frame height, the surroundings clearly visible. [LIGHTING] Cinematic lighting at TRUE NIGHT under a black sky: orange pitch-torch light flickering against cold blue darkness, drifting harbor fog, volumetric torchlight haze, Rembrandt lighting sculpting the faces; faces are lit only by the nearest flame or glow and everything beyond it falls into black; no daylight anywhere. The torches are wooden staves with rag heads soaked in fish oil and pitch. [SUBJECT &amp; ACTION] On the jetty, Tal gripping the wooden harpoon rack in his jaws, iron harpoons half sliding out of it. CHARACTERS (keep exactly as described): Tal, a fully grown adult sea dragon only about 6 feet (1.8 m) tall at the head, the size of a horse, not giant and not towering: standing on all four legs his head is level with a grown woman's head, and his body is about as long as a horse; slender and strong, with blush-pink and rose-white scales with a soft pearly sheen, large pale pink bat-like wings with faint violet veins, a crest of sharp spiky pink-white fin-frills on his head and neck, violet slit-pupil eyes, faint violet veins that glow softly, and an old brown wool scarf wrapped around his neck. VISIBLE STATE, must be clearly shown: the rack in Tal's jaws. Everyone is turned three-quarters toward the camera so every face is visible; nobody has their back to the camera and nobody looks into the lens. All mouths closed. Setting: the harbor of Kelvhaven, a medieval northern fishing village: an old wooden jetty on rough stone piers, wooden fishing boats moored on the black water, a square grey stone bell tower with a bronze bell at the harbor edge, wet stones, coils of rope, barrels and lobster pots. Early winter chill: a bitter wind, cold drizzle and sea mist, wet stone and mud, faint breath vapor in the cold air; no snow and no ice anywhere. [AESTHETIC STYLE] Photorealistic, shallow depth of field with cinematic bokeh, cinematic film still, dark fantasy, fine film grain, high-fidelity textures, desaturated high-contrast color grade, professional movie look. Palette: storm slate grey, fog grey, driftwood brown and wet-wool grey, with orange torchlight against cold blue. No text, no watermark, no modern objects.</w:t>
+        <w:t xml:space="preserve"> [ASPECT RATIO] 16:9 cinematic widescreen. [FRAMING &amp; LENS] MEDIUM WIDE SHOT from a low angle, 35mm anamorphic lens, cinematic framing, nothing cut off at the top or bottom; figures seen full-length, each no taller than about half of the frame height, the surroundings clearly visible. [LIGHTING] Cinematic lighting at TRUE NIGHT under a black sky: orange pitch-torch light flickering against cold blue darkness, drifting harbor fog, volumetric torchlight haze, Rembrandt lighting sculpting the faces; faces are lit only by the nearest flame or glow and everything beyond it falls into black; no daylight anywhere. The torches are wooden staves with rag heads soaked in fish oil and pitch. [SUBJECT &amp; ACTION] On the jetty, Tal facing the wooden harpoon rack full of iron harpoons, his chest swelling and a bright yellow-orange glow building in his throat; on the LEFT, two men running toward the rack to grab harpoons, shouting. The dragon: Tal in full fury, like a dragon in a great adventure film: snarling with his lips pulled back over rows of sharp white teeth, nostrils flared and steaming, his spiky pink-white crest raised and fanned out, wings mantled wide and high to make himself bigger, every muscle tense, claws gouging the ground, tail lashing, violet veins blazing bright, violet eyes narrowed to slits with rage. CHARACTERS (keep exactly as described): Tal, a fully grown adult sea dragon only about 6 feet (1.8 m) tall at the head, the size of a horse, not giant and not towering: standing on all four legs his head is level with a grown woman's head, and his body is about as long as a horse; slender and strong, with blush-pink and rose-white scales with a soft pearly sheen, large pale pink bat-like wings with faint violet veins, a crest of sharp spiky pink-white fin-frills on his head and neck, violet slit-pupil eyes, faint violet veins that glow softly, and an old brown wool scarf wrapped around his neck. villagers in real, everyday medieval northern fishing-village clothing in many different natural colours, every person dressed differently: layered hand-woven wool tunics, kirtles and hooded cloaks in undyed cream, oatmeal and sheep-grey, walnut brown, faded woad blue, mustard ochre and rust brown, with sheepskin vests, oiled leather jerkins, oilskin capes, wool hoods and caps, leather belts, leg-wraps and worn leather shoes; all colours muted, earthy and weathered, nothing bright; people of different heights and builds, faces under their hoods half in shadow. VISIBLE STATE, must be clearly shown: the glow in his throat, no flame yet; the fire never hits a person directly; it strikes wood, boats and stone right beside them. Everyone is turned three-quarters toward the camera so every face is visible; nobody has their back to the camera and nobody looks into the lens. All mouths closed. Setting: the harbor of Kelvhaven, a medieval northern fishing village: an old wooden jetty on rough stone piers, wooden fishing boats moored on the black water, a square grey stone bell tower with a bronze bell at the harbor edge, wet stones, coils of rope, barrels and lobster pots. Early winter chill: a bitter wind, cold drizzle and sea mist, wet stone and mud, faint breath vapor in the cold air; no snow and no ice anywhere. [AESTHETIC STYLE] Photorealistic, shallow depth of field with cinematic bokeh, cinematic film still, dark fantasy, fine film grain, high-fidelity textures, desaturated high-contrast color grade, professional movie look. Palette: storm slate grey, fog grey, driftwood brown and wet-wool grey, with orange torchlight against cold blue. No text, no watermark, no modern objects.</w:t>
       </w:r>
     </w:p>
     <w:p>
@@ -1840,7 +1840,7 @@
         <w:t xml:space="preserve">Video prompt (10 s):</w:t>
       </w:r>
       <w:r>
-        <w:t xml:space="preserve"> 10-second cinematic shot, 16:9, photorealistic dark fantasy, desaturated high-contrast grade, animate from the uploaded image. 0–5s: Tal wrenches the rack apart. 5–10s: he flings it into the harbor; the harpoons splash into the black water. RULES: no one speaks; no dialogue. Nobody looks into the camera lens and nobody turns their back to the camera. Camera: completely static, locked off on a tripod; no zoom; all motion comes from the characters, the wind, the water and the light. Early winter chill: wind tugs at hair and cloaks, light drizzle, breath vapor; no snow, no ice. Lighting stays: orange pitch-torch light flickering against cold blue darkness, drifting harbor fog, volumetric torchlight haze, Rembrandt lighting sculpting the faces; faces are lit only by the nearest flame or glow and everything beyond it falls into black; no daylight anywhere. The torches are wooden staves with rag heads soaked in fish oil and pitch. Mood: fury. Sound: splintering wood, iron clattering, splashes. Keep every face, costume and the dragon's design exactly as in the image; Tal stays horse-sized and blush-pink with violet eyes and his brown wool scarf; smooth, natural, physically real motion; no on-screen text.</w:t>
+        <w:t xml:space="preserve"> 10-second cinematic shot, 16:9, photorealistic dark fantasy, desaturated high-contrast grade, animate from the uploaded image. 0–3s: the men reach for the harpoons. 3–7s: Tal breathes a roaring jet of yellow-orange fire straight into the harpoon rack, missing the men by a stride; the fire is real and has real consequences: a roaring jet of yellow-orange flame with heat shimmer, the wood it hits bursts into flames, flying embers and black smoke, men diving and rolling away from the blast, shields blackened and smoking, a cloak hem catching fire and being beaten out on the wet stones, men shielding their faces from the heat; nobody is killed. 7–10s: the rack burns and collapses; the men stagger back, shielding their faces; Tal snarls through the smoke. RULES: no spoken lines; only wordless shouts, war cries, grunts and roars. Nobody looks into the camera lens and nobody turns their back to the camera. Camera: dynamic action camera, like a big-budget dragon battle film: handheld with a slight combat shake, starting on the men, a fast whip pan to Tal as he breathes fire, then holding wide on the burning rack; brief slow motion as the flame hits; the impact of each roar and blow shakes the camera; no cuts. Early winter chill: wind tugs at hair and cloaks, light drizzle, breath vapor; no snow, no ice. Lighting stays: orange pitch-torch light flickering against cold blue darkness, drifting harbor fog, volumetric torchlight haze, Rembrandt lighting sculpting the faces; faces are lit only by the nearest flame or glow and everything beyond it falls into black; no daylight anywhere. The torches are wooden staves with rag heads soaked in fish oil and pitch. Mood: fury. Sound: a roaring fire blast, crackling flames, shouts, a snarl. PERFORMANCE: everyone acts with real intensity: the villagers shout, snarl and fight like warriors defending their homes; Tal fights like a furious dragon (snarling, snapping, roaring with spit flying, crest flared, wings mantled, tail lashing). Keep every face, costume and the dragon's design exactly as in the image; Tal stays horse-sized and blush-pink with violet eyes and his brown wool scarf; smooth, natural, physically real motion; no on-screen text.</w:t>
       </w:r>
     </w:p>
     <w:p>
@@ -1918,7 +1918,7 @@
         <w:t xml:space="preserve">Image prompt:</w:t>
       </w:r>
       <w:r>
-        <w:t xml:space="preserve"> [ASPECT RATIO] 16:9 cinematic widescreen. [FRAMING &amp; LENS] WIDE SHOT at eye level, 35mm anamorphic lens, cinematic framing, nothing cut off at the top or bottom; the characters are small in the frame, seen full-length from head to toe, each figure no taller than about one third of the frame height, with the setting filling most of the picture. [LIGHTING] Cinematic lighting at TRUE NIGHT under a black sky: orange pitch-torch light flickering against cold blue darkness, drifting harbor fog, volumetric torchlight haze, Rembrandt lighting sculpting the faces; faces are lit only by the nearest flame or glow and everything beyond it falls into black; no daylight anywhere. The torches are wooden staves with rag heads soaked in fish oil and pitch. [SUBJECT &amp; ACTION] Tal pushing through the wooden fish-drying racks, salted fish swinging, barrels tipping over; villagers running in the background. CHARACTERS (keep exactly as described): Tal, a fully grown adult sea dragon only about 6 feet (1.8 m) tall at the head, the size of a horse, not giant and not towering: standing on all four legs his head is level with a grown woman's head, and his body is about as long as a horse; slender and strong, with blush-pink and rose-white scales with a soft pearly sheen, large pale pink bat-like wings with faint violet veins, a crest of sharp spiky pink-white fin-frills on his head and neck, violet slit-pupil eyes, faint violet veins that glow softly, and an old brown wool scarf wrapped around his neck. villagers in real, everyday medieval northern fishing-village clothing in many different natural colours, every person dressed differently: layered hand-woven wool tunics, kirtles and hooded cloaks in undyed cream, oatmeal and sheep-grey, walnut brown, faded woad blue, mustard ochre and rust brown, with sheepskin vests, oiled leather jerkins, oilskin capes, wool hoods and caps, leather belts, leg-wraps and worn leather shoes; all colours muted, earthy and weathered, nothing bright; people of different heights and builds, faces under their hoods half in shadow. Everyone is turned three-quarters toward the camera so every face is visible; nobody has their back to the camera and nobody looks into the lens. All mouths closed. Setting: the harbor market front: rows of wooden fish-drying racks hung with split salted fish, wooden stalls, stacked barrels and baskets, wet cobbles leading up from the jetty. Early winter chill: a bitter wind, cold drizzle and sea mist, wet stone and mud, faint breath vapor in the cold air; no snow and no ice anywhere. [AESTHETIC STYLE] Photorealistic, shallow depth of field with cinematic bokeh, cinematic film still, dark fantasy, fine film grain, high-fidelity textures, desaturated high-contrast color grade, professional movie look. Palette: storm slate grey, fog grey, driftwood brown and wet-wool grey, with orange torchlight against cold blue. No text, no watermark, no modern objects.</w:t>
+        <w:t xml:space="preserve"> [ASPECT RATIO] 16:9 cinematic widescreen. [FRAMING &amp; LENS] WIDE SHOT from a low angle, 35mm anamorphic lens, cinematic framing, nothing cut off at the top or bottom; the characters are small in the frame, seen full-length from head to toe, each figure no taller than about one third of the frame height, with the setting filling most of the picture. [LIGHTING] Cinematic lighting at TRUE NIGHT under a black sky: orange pitch-torch light flickering against cold blue darkness, drifting harbor fog, volumetric torchlight haze, Rembrandt lighting sculpting the faces; faces are lit only by the nearest flame or glow and everything beyond it falls into black; no daylight anywhere. The torches are wooden staves with rag heads soaked in fish oil and pitch. [SUBJECT &amp; ACTION] In the harbor market, Tal smashing through the wooden fish-drying racks with his shoulder, barrels tipping; on the LEFT, villagers hurling stones and swinging gaffs at him from behind an upturned cart. The villagers: the villagers as fierce, angry fighters, not bystanders: teeth bared, brows furrowed, faces twisted with rage and fear, mouths open in war cries, crouched in fighting stances, gripping spears, harpoons, gaffs and boat-hook poles, some holding round wooden shields and broken boat planks as cover, cloaks whipping, mud on their legs. The dragon: Tal in full fury, like a dragon in a great adventure film: snarling with his lips pulled back over rows of sharp white teeth, nostrils flared and steaming, his spiky pink-white crest raised and fanned out, wings mantled wide and high to make himself bigger, every muscle tense, claws gouging the ground, tail lashing, violet veins blazing bright, violet eyes narrowed to slits with rage. CHARACTERS (keep exactly as described): Tal, a fully grown adult sea dragon only about 6 feet (1.8 m) tall at the head, the size of a horse, not giant and not towering: standing on all four legs his head is level with a grown woman's head, and his body is about as long as a horse; slender and strong, with blush-pink and rose-white scales with a soft pearly sheen, large pale pink bat-like wings with faint violet veins, a crest of sharp spiky pink-white fin-frills on his head and neck, violet slit-pupil eyes, faint violet veins that glow softly, and an old brown wool scarf wrapped around his neck. villagers in real, everyday medieval northern fishing-village clothing in many different natural colours, every person dressed differently: layered hand-woven wool tunics, kirtles and hooded cloaks in undyed cream, oatmeal and sheep-grey, walnut brown, faded woad blue, mustard ochre and rust brown, with sheepskin vests, oiled leather jerkins, oilskin capes, wool hoods and caps, leather belts, leg-wraps and worn leather shoes; all colours muted, earthy and weathered, nothing bright; people of different heights and builds, faces under their hoods half in shadow. Everyone is turned three-quarters toward the camera so every face is visible; nobody has their back to the camera and nobody looks into the lens. All mouths closed. Setting: the harbor market front: rows of wooden fish-drying racks hung with split salted fish, wooden stalls, stacked barrels and baskets, wet cobbles leading up from the jetty. Early winter chill: a bitter wind, cold drizzle and sea mist, wet stone and mud, faint breath vapor in the cold air; no snow and no ice anywhere. [AESTHETIC STYLE] Photorealistic, shallow depth of field with cinematic bokeh, cinematic film still, dark fantasy, fine film grain, high-fidelity textures, desaturated high-contrast color grade, professional movie look. Palette: storm slate grey, fog grey, driftwood brown and wet-wool grey, with orange torchlight against cold blue. No text, no watermark, no modern objects.</w:t>
       </w:r>
     </w:p>
     <w:p>
@@ -1938,7 +1938,7 @@
         <w:t xml:space="preserve">Video prompt (10 s):</w:t>
       </w:r>
       <w:r>
-        <w:t xml:space="preserve"> 10-second cinematic shot, 16:9, photorealistic dark fantasy, desaturated high-contrast grade, animate from the uploaded image. 0–6s: the racks collapse; barrels roll across the cobbles; salted fish scatter. 6–10s: Tal moves on up toward the cottages, sniffing the air. RULES: no one speaks; no dialogue. Nobody looks into the camera lens and nobody turns their back to the camera. Camera: one slow, smooth pan following Tal; no zoom. Early winter chill: wind tugs at hair and cloaks, light drizzle, breath vapor; no snow, no ice. Lighting stays: orange pitch-torch light flickering against cold blue darkness, drifting harbor fog, volumetric torchlight haze, Rembrandt lighting sculpting the faces; faces are lit only by the nearest flame or glow and everything beyond it falls into black; no daylight anywhere. The torches are wooden staves with rag heads soaked in fish oil and pitch. Mood: chaos. Sound: crashing wood, rolling barrels, distant screams. Keep every face, costume and the dragon's design exactly as in the image; Tal stays horse-sized and blush-pink with violet eyes and his brown wool scarf; smooth, natural, physically real motion; no on-screen text.</w:t>
+        <w:t xml:space="preserve"> 10-second cinematic shot, 16:9, photorealistic dark fantasy, desaturated high-contrast grade, animate from the uploaded image. 0–5s: the racks collapse; barrels roll across the cobbles; Tal whips his tail and scatters the upturned cart; the men dive aside. 5–10s: a stone bounces off his crest; he swings his head toward the throwers and snaps the air, then turns and pushes on up toward the cottages, sniffing for Maren. RULES: no spoken lines; only wordless shouts, war cries, grunts and roars. Nobody looks into the camera lens and nobody turns their back to the camera. Camera: dynamic action camera, like a big-budget dragon battle film: handheld with a slight combat shake, a fast lateral tracking shot alongside the dragon at ground level; the impact of each roar and blow shakes the camera; no cuts. Early winter chill: wind tugs at hair and cloaks, light drizzle, breath vapor; no snow, no ice. Lighting stays: orange pitch-torch light flickering against cold blue darkness, drifting harbor fog, volumetric torchlight haze, Rembrandt lighting sculpting the faces; faces are lit only by the nearest flame or glow and everything beyond it falls into black; no daylight anywhere. The torches are wooden staves with rag heads soaked in fish oil and pitch. Mood: fury. Sound: crashing wood, rolling barrels, a snarl, shouts. PERFORMANCE: everyone acts with real intensity: the villagers shout, snarl and fight like warriors defending their homes; Tal fights like a furious dragon (snarling, snapping, roaring with spit flying, crest flared, wings mantled, tail lashing). Keep every face, costume and the dragon's design exactly as in the image; Tal stays horse-sized and blush-pink with violet eyes and his brown wool scarf; smooth, natural, physically real motion; no on-screen text.</w:t>
       </w:r>
     </w:p>
     <w:p>
@@ -2408,7 +2408,7 @@
         <w:t xml:space="preserve">Image prompt:</w:t>
       </w:r>
       <w:r>
-        <w:t xml:space="preserve"> [ASPECT RATIO] 16:9 cinematic widescreen. [FRAMING &amp; LENS] WIDE SHOT from a low angle, 35mm anamorphic lens, cinematic framing, nothing cut off at the top or bottom; the characters are small in the frame, seen full-length from head to toe, each figure no taller than about one third of the frame height, with the setting filling most of the picture. [LIGHTING] Cinematic lighting at TRUE NIGHT under a black sky: orange pitch-torch light flickering against cold blue darkness, drifting harbor fog, volumetric torchlight haze, Rembrandt lighting sculpting the faces; faces are lit only by the nearest flame or glow and everything beyond it falls into black; no daylight anywhere. The torches are wooden staves with rag heads soaked in fish oil and pitch. [SUBJECT &amp; ACTION] On the LEFT, Bram standing in the lane with a harpoon raised at his shoulder; on the RIGHT, about 12 meters away, Tal turning toward him. CHARACTERS (keep exactly as described): Bram, a burly man about 40 with a scarred jaw, wet curly red-brown hair and a thick matted red-brown beard, wearing a heavy, shaggy, knee-length coat of worn brown and tan sheepskin fleece with a wide fleece collar, over a stained brown wool tunic with a wide leather belt, rough brown wool trousers and tall worn brown leather boots. Tal, a fully grown adult sea dragon only about 6 feet (1.8 m) tall at the head, the size of a horse, not giant and not towering: standing on all four legs his head is level with a grown woman's head, and his body is about as long as a horse; slender and strong, with blush-pink and rose-white scales with a soft pearly sheen, large pale pink bat-like wings with faint violet veins, a crest of sharp spiky pink-white fin-frills on his head and neck, violet slit-pupil eyes, faint violet veins that glow softly, and an old brown wool scarf wrapped around his neck. VISIBLE STATE, must be clearly shown: the harpoon in Bram's hand. Everyone is turned three-quarters toward the camera so every face is visible; nobody has their back to the camera and nobody looks into the lens. All mouths closed. Setting: the main lane of Kelvhaven: low grey fieldstone cottages with thick green turf roofs, weathered wooden doors and shutters, a muddy cobbled lane sloping down toward the harbor. Early winter chill: a bitter wind, cold drizzle and sea mist, wet stone and mud, faint breath vapor in the cold air; no snow and no ice anywhere. [AESTHETIC STYLE] Photorealistic, shallow depth of field with cinematic bokeh, cinematic film still, dark fantasy, fine film grain, high-fidelity textures, desaturated high-contrast color grade, professional movie look. Palette: storm slate grey, fog grey, driftwood brown and wet-wool grey, with orange torchlight against cold blue. No text, no watermark, no modern objects.</w:t>
+        <w:t xml:space="preserve"> [ASPECT RATIO] 16:9 cinematic widescreen. [FRAMING &amp; LENS] WIDE SHOT from a very low angle, 35mm anamorphic lens, cinematic framing, nothing cut off at the top or bottom; the characters are small in the frame, seen full-length from head to toe, each figure no taller than about one third of the frame height, with the setting filling most of the picture. [LIGHTING] Cinematic lighting at TRUE NIGHT under a black sky: orange pitch-torch light flickering against cold blue darkness, drifting harbor fog, volumetric torchlight haze, Rembrandt lighting sculpting the faces; faces are lit only by the nearest flame or glow and everything beyond it falls into black; no daylight anywhere. The torches are wooden staves with rag heads soaked in fish oil and pitch. [SUBJECT &amp; ACTION] A duel in the lane: on the LEFT, Bram standing his ground with a harpoon raised at his shoulder, teeth bared, face twisted with rage; on the RIGHT, about 12 meters away, Tal turning toward him, head low, snarling. The dragon: Tal in full fury, like a dragon in a great adventure film: snarling with his lips pulled back over rows of sharp white teeth, nostrils flared and steaming, his spiky pink-white crest raised and fanned out, wings mantled wide and high to make himself bigger, every muscle tense, claws gouging the ground, tail lashing, violet veins blazing bright, violet eyes narrowed to slits with rage. CHARACTERS (keep exactly as described): Bram, a burly man about 40 with a scarred jaw, wet curly red-brown hair and a thick matted red-brown beard, wearing a heavy, shaggy, knee-length coat of worn brown and tan sheepskin fleece with a wide fleece collar, over a stained brown wool tunic with a wide leather belt, rough brown wool trousers and tall worn brown leather boots. Tal, a fully grown adult sea dragon only about 6 feet (1.8 m) tall at the head, the size of a horse, not giant and not towering: standing on all four legs his head is level with a grown woman's head, and his body is about as long as a horse; slender and strong, with blush-pink and rose-white scales with a soft pearly sheen, large pale pink bat-like wings with faint violet veins, a crest of sharp spiky pink-white fin-frills on his head and neck, violet slit-pupil eyes, faint violet veins that glow softly, and an old brown wool scarf wrapped around his neck. VISIBLE STATE, must be clearly shown: the harpoon in Bram's hand. Everyone is turned three-quarters toward the camera so every face is visible; nobody has their back to the camera and nobody looks into the lens. All mouths closed. Setting: the main lane of Kelvhaven: low grey fieldstone cottages with thick green turf roofs, weathered wooden doors and shutters, a muddy cobbled lane sloping down toward the harbor. Early winter chill: a bitter wind, cold drizzle and sea mist, wet stone and mud, faint breath vapor in the cold air; no snow and no ice anywhere. [AESTHETIC STYLE] Photorealistic, shallow depth of field with cinematic bokeh, cinematic film still, dark fantasy, fine film grain, high-fidelity textures, desaturated high-contrast color grade, professional movie look. Palette: storm slate grey, fog grey, driftwood brown and wet-wool grey, with orange torchlight against cold blue. No text, no watermark, no modern objects.</w:t>
       </w:r>
     </w:p>
     <w:p>
@@ -2428,7 +2428,7 @@
         <w:t xml:space="preserve">Video prompt (10 s):</w:t>
       </w:r>
       <w:r>
-        <w:t xml:space="preserve"> 10-second cinematic shot, 16:9, photorealistic dark fantasy, desaturated high-contrast grade, animate from the uploaded image. 0–5s: SPEAKER: Bram, the burly man in the shaggy sheepskin coat, face three-quarters to the camera, eyes on the dragon. Bram says: "Over here, devil! Look at me!" 5–10s: Tal turns fully toward him and growls. RULES: only Bram speaks, one voice only (Bram's voice: a man about 40: a very deep, rough, gravelly American voice, loud, hard and sneering, with short clipped words); the voice is dry, clear and close to the microphone, with no echo and no reverb; everyone else keeps their mouth closed. Nobody looks into the camera lens and nobody turns their back to the camera. Camera: completely static, locked off on a tripod; no zoom; all motion comes from the characters, the wind, the water and the light. Early winter chill: wind tugs at hair and cloaks, light drizzle, breath vapor; no snow, no ice. Lighting stays: orange pitch-torch light flickering against cold blue darkness, drifting harbor fog, volumetric torchlight haze, Rembrandt lighting sculpting the faces; faces are lit only by the nearest flame or glow and everything beyond it falls into black; no daylight anywhere. The torches are wooden staves with rag heads soaked in fish oil and pitch. Mood: menace. Sound: wind, Tal's growl. Keep every face, costume and the dragon's design exactly as in the image; Tal stays horse-sized and blush-pink with violet eyes and his brown wool scarf; smooth, natural, physically real motion; no on-screen text.</w:t>
+        <w:t xml:space="preserve"> 10-second cinematic shot, 16:9, photorealistic dark fantasy, desaturated high-contrast grade, animate from the uploaded image. 0–5s: SPEAKER: Bram, the burly man in the shaggy sheepskin coat, bellowing with fury, face three-quarters to the camera, eyes on the dragon. Bram says: "Over here, devil! Look at me!" 5–10s: Tal turns fully toward him, lowers his head and growls, claws gouging the cobbles; they circle each other one step. RULES: only Bram speaks, one voice only (Bram's voice: a man about 40: a very deep, rough, gravelly American voice, loud, hard and sneering, with short clipped words); the voice is dry, clear and close to the microphone, with no echo and no reverb; everyone else keeps their mouth closed. Nobody looks into the camera lens and nobody turns their back to the camera. Camera: dynamic action camera, like a big-budget dragon battle film: handheld with a slight combat shake, a slow circling move around both of them at a low angle, ending on Tal's narrowed eye; the impact of each roar and blow shakes the camera; no cuts. Early winter chill: wind tugs at hair and cloaks, light drizzle, breath vapor; no snow, no ice. Lighting stays: orange pitch-torch light flickering against cold blue darkness, drifting harbor fog, volumetric torchlight haze, Rembrandt lighting sculpting the faces; faces are lit only by the nearest flame or glow and everything beyond it falls into black; no daylight anywhere. The torches are wooden staves with rag heads soaked in fish oil and pitch. Mood: fury. Sound: wind, a deep growl, claws on stone. PERFORMANCE: everyone acts with real intensity: the villagers shout, snarl and fight like warriors defending their homes; Tal fights like a furious dragon (snarling, snapping, roaring with spit flying, crest flared, wings mantled, tail lashing). Keep every face, costume and the dragon's design exactly as in the image; Tal stays horse-sized and blush-pink with violet eyes and his brown wool scarf; smooth, natural, physically real motion; no on-screen text.</w:t>
       </w:r>
     </w:p>
     <w:p>
@@ -2506,7 +2506,7 @@
         <w:t xml:space="preserve">Image prompt:</w:t>
       </w:r>
       <w:r>
-        <w:t xml:space="preserve"> [ASPECT RATIO] 16:9 cinematic widescreen. [FRAMING &amp; LENS] WIDE SHOT from a low angle, 35mm anamorphic lens, cinematic framing, nothing cut off at the top or bottom; the characters are small in the frame, seen full-length from head to toe, each figure no taller than about one third of the frame height, with the setting filling most of the picture. [LIGHTING] Cinematic lighting at TRUE NIGHT under a black sky: orange pitch-torch light flickering against cold blue darkness, drifting harbor fog, volumetric torchlight haze, Rembrandt lighting sculpting the faces; faces are lit only by the nearest flame or glow and everything beyond it falls into black; no daylight anywhere. The torches are wooden staves with rag heads soaked in fish oil and pitch. [SUBJECT &amp; ACTION] The same lane: on the LEFT, Bram with his arm extended mid-throw; the harpoon in the air between them; on the RIGHT, Tal. CHARACTERS (keep exactly as described): Bram, a burly man about 40 with a scarred jaw, wet curly red-brown hair and a thick matted red-brown beard, wearing a heavy, shaggy, knee-length coat of worn brown and tan sheepskin fleece with a wide fleece collar, over a stained brown wool tunic with a wide leather belt, rough brown wool trousers and tall worn brown leather boots. Tal, a fully grown adult sea dragon only about 6 feet (1.8 m) tall at the head, the size of a horse, not giant and not towering: standing on all four legs his head is level with a grown woman's head, and his body is about as long as a horse; slender and strong, with blush-pink and rose-white scales with a soft pearly sheen, large pale pink bat-like wings with faint violet veins, a crest of sharp spiky pink-white fin-frills on his head and neck, violet slit-pupil eyes, faint violet veins that glow softly, and an old brown wool scarf wrapped around his neck. VISIBLE STATE, must be clearly shown: the harpoon in mid-air, not yet touching Tal. Everyone is turned three-quarters toward the camera so every face is visible; nobody has their back to the camera and nobody looks into the lens. All mouths closed. Setting: the main lane of Kelvhaven: low grey fieldstone cottages with thick green turf roofs, weathered wooden doors and shutters, a muddy cobbled lane sloping down toward the harbor. Early winter chill: a bitter wind, cold drizzle and sea mist, wet stone and mud, faint breath vapor in the cold air; no snow and no ice anywhere. [AESTHETIC STYLE] Photorealistic, shallow depth of field with cinematic bokeh, cinematic film still, dark fantasy, fine film grain, high-fidelity textures, desaturated high-contrast color grade, professional movie look. Palette: storm slate grey, fog grey, driftwood brown and wet-wool grey, with orange torchlight against cold blue. No text, no watermark, no modern objects.</w:t>
+        <w:t xml:space="preserve"> [ASPECT RATIO] 16:9 cinematic widescreen. [FRAMING &amp; LENS] WIDE SHOT from a low angle, 35mm anamorphic lens, cinematic framing, nothing cut off at the top or bottom; the characters are small in the frame, seen full-length from head to toe, each figure no taller than about one third of the frame height, with the setting filling most of the picture. [LIGHTING] Cinematic lighting at TRUE NIGHT under a black sky: orange pitch-torch light flickering against cold blue darkness, drifting harbor fog, volumetric torchlight haze, Rembrandt lighting sculpting the faces; faces are lit only by the nearest flame or glow and everything beyond it falls into black; no daylight anywhere. The torches are wooden staves with rag heads soaked in fish oil and pitch. [SUBJECT &amp; ACTION] The same lane: on the LEFT, Bram with his arm extended mid-throw, his face snarling with effort; the harpoon in the air between them; on the RIGHT, Tal charging toward him. The dragon: Tal in full fury, like a dragon in a great adventure film: snarling with his lips pulled back over rows of sharp white teeth, nostrils flared and steaming, his spiky pink-white crest raised and fanned out, wings mantled wide and high to make himself bigger, every muscle tense, claws gouging the ground, tail lashing, violet veins blazing bright, violet eyes narrowed to slits with rage. CHARACTERS (keep exactly as described): Bram, a burly man about 40 with a scarred jaw, wet curly red-brown hair and a thick matted red-brown beard, wearing a heavy, shaggy, knee-length coat of worn brown and tan sheepskin fleece with a wide fleece collar, over a stained brown wool tunic with a wide leather belt, rough brown wool trousers and tall worn brown leather boots. Tal, a fully grown adult sea dragon only about 6 feet (1.8 m) tall at the head, the size of a horse, not giant and not towering: standing on all four legs his head is level with a grown woman's head, and his body is about as long as a horse; slender and strong, with blush-pink and rose-white scales with a soft pearly sheen, large pale pink bat-like wings with faint violet veins, a crest of sharp spiky pink-white fin-frills on his head and neck, violet slit-pupil eyes, faint violet veins that glow softly, and an old brown wool scarf wrapped around his neck. VISIBLE STATE, must be clearly shown: the harpoon in mid-air, not yet touching Tal. Everyone is turned three-quarters toward the camera so every face is visible; nobody has their back to the camera and nobody looks into the lens. All mouths closed. Setting: the main lane of Kelvhaven: low grey fieldstone cottages with thick green turf roofs, weathered wooden doors and shutters, a muddy cobbled lane sloping down toward the harbor. Early winter chill: a bitter wind, cold drizzle and sea mist, wet stone and mud, faint breath vapor in the cold air; no snow and no ice anywhere. [AESTHETIC STYLE] Photorealistic, shallow depth of field with cinematic bokeh, cinematic film still, dark fantasy, fine film grain, high-fidelity textures, desaturated high-contrast color grade, professional movie look. Palette: storm slate grey, fog grey, driftwood brown and wet-wool grey, with orange torchlight against cold blue. No text, no watermark, no modern objects.</w:t>
       </w:r>
     </w:p>
     <w:p>
@@ -2526,7 +2526,7 @@
         <w:t xml:space="preserve">Video prompt (10 s):</w:t>
       </w:r>
       <w:r>
-        <w:t xml:space="preserve"> 10-second cinematic shot, 16:9, photorealistic dark fantasy, desaturated high-contrast grade, animate from the uploaded image. 0–4s: the harpoon flies. 4–10s: it grazes Tal's shoulder, leaving a dark cut across his pink scales, and clangs onto the cobbles; Tal roars in pain and rears. RULES: no one speaks; no dialogue. Nobody looks into the camera lens and nobody turns their back to the camera. Camera: completely static, locked off on a tripod; no zoom; all motion comes from the characters, the wind, the water and the light. Early winter chill: wind tugs at hair and cloaks, light drizzle, breath vapor; no snow, no ice. Lighting stays: orange pitch-torch light flickering against cold blue darkness, drifting harbor fog, volumetric torchlight haze, Rembrandt lighting sculpting the faces; faces are lit only by the nearest flame or glow and everything beyond it falls into black; no daylight anywhere. The torches are wooden staves with rag heads soaked in fish oil and pitch. Mood: violent. Sound: a whistle through the air, a clang, a roar of pain. Keep every face, costume and the dragon's design exactly as in the image; Tal stays horse-sized and blush-pink with violet eyes and his brown wool scarf; smooth, natural, physically real motion; no on-screen text.</w:t>
+        <w:t xml:space="preserve"> 10-second cinematic shot, 16:9, photorealistic dark fantasy, desaturated high-contrast grade, animate from the uploaded image. 0–3s: the harpoon flies. 3–6s: it grazes Tal's shoulder, slicing a dark cut across his pink scales, and clangs onto the cobbles. 6–10s: Tal rears onto his hind legs with a shrieking roar of pain and rage, wings fully spread over the lane, then crashes back down. RULES: no spoken lines; only wordless shouts, war cries, grunts and roars. Nobody looks into the camera lens and nobody turns their back to the camera. Camera: dynamic action camera, like a big-budget dragon battle film: handheld with a slight combat shake, following the harpoon in a fast whip pan, then a low push-in as Tal rears over the camera; the impact of each roar and blow shakes the camera; no cuts. Early winter chill: wind tugs at hair and cloaks, light drizzle, breath vapor; no snow, no ice. Lighting stays: orange pitch-torch light flickering against cold blue darkness, drifting harbor fog, volumetric torchlight haze, Rembrandt lighting sculpting the faces; faces are lit only by the nearest flame or glow and everything beyond it falls into black; no daylight anywhere. The torches are wooden staves with rag heads soaked in fish oil and pitch. Mood: fury. Sound: a whistle through the air, a clang, a shrieking roar. PERFORMANCE: everyone acts with real intensity: the villagers shout, snarl and fight like warriors defending their homes; Tal fights like a furious dragon (snarling, snapping, roaring with spit flying, crest flared, wings mantled, tail lashing). Keep every face, costume and the dragon's design exactly as in the image; Tal stays horse-sized and blush-pink with violet eyes and his brown wool scarf; smooth, natural, physically real motion; no on-screen text.</w:t>
       </w:r>
     </w:p>
     <w:p>
@@ -2604,7 +2604,7 @@
         <w:t xml:space="preserve">Image prompt:</w:t>
       </w:r>
       <w:r>
-        <w:t xml:space="preserve"> [ASPECT RATIO] 16:9 cinematic widescreen. [FRAMING &amp; LENS] MEDIUM WIDE SHOT from a low angle, 35mm anamorphic lens, cinematic framing, nothing cut off at the top or bottom; figures seen full-length, each no taller than about half of the frame height, the surroundings clearly visible. [LIGHTING] Cinematic lighting at TRUE NIGHT under a black sky: orange pitch-torch light flickering against cold blue darkness, drifting harbor fog, volumetric torchlight haze, Rembrandt lighting sculpting the faces; faces are lit only by the nearest flame or glow and everything beyond it falls into black; no daylight anywhere. The torches are wooden staves with rag heads soaked in fish oil and pitch; a yellow-orange fire glow from inside the dragon's throat. [SUBJECT &amp; ACTION] On the RIGHT, Tal with his head lowered and jaws parted, a yellow-orange fire glow building in his throat and chest, a fresh cut on his shoulder; on the LEFT, Bram stumbling backward onto the cobbles; villagers fleeing behind. CHARACTERS (keep exactly as described): Tal, a fully grown adult sea dragon only about 6 feet (1.8 m) tall at the head, the size of a horse, not giant and not towering: standing on all four legs his head is level with a grown woman's head, and his body is about as long as a horse; slender and strong, with blush-pink and rose-white scales with a soft pearly sheen, large pale pink bat-like wings with faint violet veins, a crest of sharp spiky pink-white fin-frills on his head and neck, violet slit-pupil eyes, faint violet veins that glow softly, and an old brown wool scarf wrapped around his neck. Bram, a burly man about 40 with a scarred jaw, wet curly red-brown hair and a thick matted red-brown beard, wearing a heavy, shaggy, knee-length coat of worn brown and tan sheepskin fleece with a wide fleece collar, over a stained brown wool tunic with a wide leather belt, rough brown wool trousers and tall worn brown leather boots. villagers in real, everyday medieval northern fishing-village clothing in many different natural colours, every person dressed differently: layered hand-woven wool tunics, kirtles and hooded cloaks in undyed cream, oatmeal and sheep-grey, walnut brown, faded woad blue, mustard ochre and rust brown, with sheepskin vests, oiled leather jerkins, oilskin capes, wool hoods and caps, leather belts, leg-wraps and worn leather shoes; all colours muted, earthy and weathered, nothing bright; people of different heights and builds, faces under their hoods half in shadow. VISIBLE STATE, must be clearly shown: the fire glow inside Tal's throat, no flames out of his mouth yet. Everyone is turned three-quarters toward the camera so every face is visible; nobody has their back to the camera and nobody looks into the lens. All mouths closed. Setting: the main lane of Kelvhaven: low grey fieldstone cottages with thick green turf roofs, weathered wooden doors and shutters, a muddy cobbled lane sloping down toward the harbor. Early winter chill: a bitter wind, cold drizzle and sea mist, wet stone and mud, faint breath vapor in the cold air; no snow and no ice anywhere. [AESTHETIC STYLE] Photorealistic, shallow depth of field with cinematic bokeh, cinematic film still, dark fantasy, fine film grain, high-fidelity textures, desaturated high-contrast color grade, professional movie look. Palette: storm slate grey, fog grey, driftwood brown and wet-wool grey, with orange torchlight against cold blue. No text, no watermark, no modern objects.</w:t>
+        <w:t xml:space="preserve"> [ASPECT RATIO] 16:9 cinematic widescreen. [FRAMING &amp; LENS] MEDIUM WIDE SHOT from a very low angle, 35mm anamorphic lens, cinematic framing, nothing cut off at the top or bottom; figures seen full-length, each no taller than about half of the frame height, the surroundings clearly visible. [LIGHTING] Cinematic lighting at TRUE NIGHT under a black sky: orange pitch-torch light flickering against cold blue darkness, drifting harbor fog, volumetric torchlight haze, Rembrandt lighting sculpting the faces; faces are lit only by the nearest flame or glow and everything beyond it falls into black; no daylight anywhere. The torches are wooden staves with rag heads soaked in fish oil and pitch; a yellow-orange fire glow from inside the dragon's throat. [SUBJECT &amp; ACTION] On the RIGHT, Tal stalking forward with his head lowered and jaws parted, a yellow-orange fire glow building in his throat and chest, a fresh bleeding cut on his shoulder, smoke curling from his teeth; on the LEFT, Bram knocked onto his back on the cobbles, reaching for his fallen harpoon; villagers behind him raising shields and planks. The dragon: Tal in full fury, like a dragon in a great adventure film: snarling with his lips pulled back over rows of sharp white teeth, nostrils flared and steaming, his spiky pink-white crest raised and fanned out, wings mantled wide and high to make himself bigger, every muscle tense, claws gouging the ground, tail lashing, violet veins blazing bright, violet eyes narrowed to slits with rage. CHARACTERS (keep exactly as described): Tal, a fully grown adult sea dragon only about 6 feet (1.8 m) tall at the head, the size of a horse, not giant and not towering: standing on all four legs his head is level with a grown woman's head, and his body is about as long as a horse; slender and strong, with blush-pink and rose-white scales with a soft pearly sheen, large pale pink bat-like wings with faint violet veins, a crest of sharp spiky pink-white fin-frills on his head and neck, violet slit-pupil eyes, faint violet veins that glow softly, and an old brown wool scarf wrapped around his neck. Bram, a burly man about 40 with a scarred jaw, wet curly red-brown hair and a thick matted red-brown beard, wearing a heavy, shaggy, knee-length coat of worn brown and tan sheepskin fleece with a wide fleece collar, over a stained brown wool tunic with a wide leather belt, rough brown wool trousers and tall worn brown leather boots. villagers in real, everyday medieval northern fishing-village clothing in many different natural colours, every person dressed differently: layered hand-woven wool tunics, kirtles and hooded cloaks in undyed cream, oatmeal and sheep-grey, walnut brown, faded woad blue, mustard ochre and rust brown, with sheepskin vests, oiled leather jerkins, oilskin capes, wool hoods and caps, leather belts, leg-wraps and worn leather shoes; all colours muted, earthy and weathered, nothing bright; people of different heights and builds, faces under their hoods half in shadow. VISIBLE STATE, must be clearly shown: the fire glow inside Tal's throat, no flame out yet. Everyone is turned three-quarters toward the camera so every face is visible; nobody has their back to the camera and nobody looks into the lens. All mouths closed. Setting: the main lane of Kelvhaven: low grey fieldstone cottages with thick green turf roofs, weathered wooden doors and shutters, a muddy cobbled lane sloping down toward the harbor. Early winter chill: a bitter wind, cold drizzle and sea mist, wet stone and mud, faint breath vapor in the cold air; no snow and no ice anywhere. [AESTHETIC STYLE] Photorealistic, shallow depth of field with cinematic bokeh, cinematic film still, dark fantasy, fine film grain, high-fidelity textures, desaturated high-contrast color grade, professional movie look. Palette: storm slate grey, fog grey, driftwood brown and wet-wool grey, with orange torchlight against cold blue. No text, no watermark, no modern objects.</w:t>
       </w:r>
     </w:p>
     <w:p>
@@ -2624,7 +2624,7 @@
         <w:t xml:space="preserve">Video prompt (10 s):</w:t>
       </w:r>
       <w:r>
-        <w:t xml:space="preserve"> 10-second cinematic shot, 16:9, photorealistic dark fantasy, desaturated high-contrast grade, animate from the uploaded image. 0–10s: the fire glow brightens in Tal's throat; Bram scrambles backward on the cobbles; the villagers behind him scream and flee. RULES: no one speaks; no dialogue. Nobody looks into the camera lens and nobody turns their back to the camera. Camera: completely static, locked off on a tripod; no zoom; all motion comes from the characters, the wind, the water and the light. Early winter chill: wind tugs at hair and cloaks, light drizzle, breath vapor; no snow, no ice. Lighting stays: orange pitch-torch light flickering against cold blue darkness, drifting harbor fog, volumetric torchlight haze, Rembrandt lighting sculpting the faces; faces are lit only by the nearest flame or glow and everything beyond it falls into black; no daylight anywhere. The torches are wooden staves with rag heads soaked in fish oil and pitch. Mood: terror. Sound: a rising roar, screams. Keep every face, costume and the dragon's design exactly as in the image; Tal stays horse-sized and blush-pink with violet eyes and his brown wool scarf; smooth, natural, physically real motion; no on-screen text.</w:t>
+        <w:t xml:space="preserve"> 10-second cinematic shot, 16:9, photorealistic dark fantasy, desaturated high-contrast grade, animate from the uploaded image. 0–4s: Tal blasts a short jet of fire into the cobbles beside Bram's hand, missing him by an arm's length; the harpoon handle bursts into flames; Bram jerks his hand back. 4–10s: the villagers behind raise their shields as embers rain on them; Tal keeps stalking forward, the glow rebuilding in his throat; the fire is real and has real consequences: a roaring jet of yellow-orange flame with heat shimmer, the wood it hits bursts into flames, flying embers and black smoke, men diving and rolling away from the blast, shields blackened and smoking, a cloak hem catching fire and being beaten out on the wet stones, men shielding their faces from the heat; nobody is killed. RULES: no spoken lines; only wordless shouts, war cries, grunts and roars. Nobody looks into the camera lens and nobody turns their back to the camera. Camera: dynamic action camera, like a big-budget dragon battle film: handheld with a slight combat shake, low behind the flaming harpoon in the foreground, a slow push toward Tal's glowing jaws; the impact of each roar and blow shakes the camera; no cuts. Early winter chill: wind tugs at hair and cloaks, light drizzle, breath vapor; no snow, no ice. Lighting stays: orange pitch-torch light flickering against cold blue darkness, drifting harbor fog, volumetric torchlight haze, Rembrandt lighting sculpting the faces; faces are lit only by the nearest flame or glow and everything beyond it falls into black; no daylight anywhere. The torches are wooden staves with rag heads soaked in fish oil and pitch. Mood: fury. Sound: a fire blast, crackling flames, screams, a deep growl. PERFORMANCE: everyone acts with real intensity: the villagers shout, snarl and fight like warriors defending their homes; Tal fights like a furious dragon (snarling, snapping, roaring with spit flying, crest flared, wings mantled, tail lashing). Keep every face, costume and the dragon's design exactly as in the image; Tal stays horse-sized and blush-pink with violet eyes and his brown wool scarf; smooth, natural, physically real motion; no on-screen text.</w:t>
       </w:r>
     </w:p>
     <w:p>
@@ -2702,7 +2702,7 @@
         <w:t xml:space="preserve">Image prompt:</w:t>
       </w:r>
       <w:r>
-        <w:t xml:space="preserve"> [ASPECT RATIO] 16:9 cinematic widescreen. [FRAMING &amp; LENS] MEDIUM SHOT from a low angle, 35mm anamorphic lens, cinematic framing, figures seen from the knees up with breathing room above their heads. [LIGHTING] Cinematic lighting at TRUE NIGHT under a black sky: orange pitch-torch light flickering against cold blue darkness, drifting harbor fog, volumetric torchlight haze, Rembrandt lighting sculpting the faces; faces are lit only by the nearest flame or glow and everything beyond it falls into black; no daylight anywhere. The torches are wooden staves with rag heads soaked in fish oil and pitch; the yellow-orange glow from the dragon's open jaws lights Bram's face. [SUBJECT &amp; ACTION] On the RIGHT, Tal looming over Bram, the yellow-orange fire glow bright in his open jaws; on the LEFT, Bram lying on the cobbles staring up, terrified. CHARACTERS (keep exactly as described): Tal, a fully grown adult sea dragon only about 6 feet (1.8 m) tall at the head, the size of a horse, not giant and not towering: standing on all four legs his head is level with a grown woman's head, and his body is about as long as a horse; slender and strong, with blush-pink and rose-white scales with a soft pearly sheen, large pale pink bat-like wings with faint violet veins, a crest of sharp spiky pink-white fin-frills on his head and neck, violet slit-pupil eyes, faint violet veins that glow softly, and an old brown wool scarf wrapped around his neck. Bram, a burly man about 40 with a scarred jaw, wet curly red-brown hair and a thick matted red-brown beard, wearing a heavy, shaggy, knee-length coat of worn brown and tan sheepskin fleece with a wide fleece collar, over a stained brown wool tunic with a wide leather belt, rough brown wool trousers and tall worn brown leather boots. VISIBLE STATE, must be clearly shown: the glow in his jaws, no fire released. Everyone is turned three-quarters toward the camera so every face is visible; nobody has their back to the camera and nobody looks into the lens. All mouths closed. Setting: the main lane of Kelvhaven: low grey fieldstone cottages with thick green turf roofs, weathered wooden doors and shutters, a muddy cobbled lane sloping down toward the harbor. Early winter chill: a bitter wind, cold drizzle and sea mist, wet stone and mud, faint breath vapor in the cold air; no snow and no ice anywhere. [AESTHETIC STYLE] Photorealistic, shallow depth of field with cinematic bokeh, cinematic film still, dark fantasy, fine film grain, high-fidelity textures, desaturated high-contrast color grade, professional movie look. Palette: storm slate grey, fog grey, driftwood brown and wet-wool grey, with orange torchlight against cold blue. No text, no watermark, no modern objects.</w:t>
+        <w:t xml:space="preserve"> [ASPECT RATIO] 16:9 cinematic widescreen. [FRAMING &amp; LENS] MEDIUM SHOT from a worm's-eye low angle, 35mm anamorphic lens, cinematic framing, figures seen from the knees up with breathing room above their heads. [LIGHTING] Cinematic lighting at TRUE NIGHT under a black sky: orange pitch-torch light flickering against cold blue darkness, drifting harbor fog, volumetric torchlight haze, Rembrandt lighting sculpting the faces; faces are lit only by the nearest flame or glow and everything beyond it falls into black; no daylight anywhere. The torches are wooden staves with rag heads soaked in fish oil and pitch; the yellow-orange glow from the dragon's open jaws lights Bram's face. [SUBJECT &amp; ACTION] On the RIGHT, Tal looming over Bram, the yellow-orange fire glow bright in his open jaws, spit and smoke dripping from his teeth, his crest flared; on the LEFT, Bram on his back on the cobbles staring up, terrified, his arm raised. The dragon: Tal in full fury, like a dragon in a great adventure film: snarling with his lips pulled back over rows of sharp white teeth, nostrils flared and steaming, his spiky pink-white crest raised and fanned out, wings mantled wide and high to make himself bigger, every muscle tense, claws gouging the ground, tail lashing, violet veins blazing bright, violet eyes narrowed to slits with rage. CHARACTERS (keep exactly as described): Tal, a fully grown adult sea dragon only about 6 feet (1.8 m) tall at the head, the size of a horse, not giant and not towering: standing on all four legs his head is level with a grown woman's head, and his body is about as long as a horse; slender and strong, with blush-pink and rose-white scales with a soft pearly sheen, large pale pink bat-like wings with faint violet veins, a crest of sharp spiky pink-white fin-frills on his head and neck, violet slit-pupil eyes, faint violet veins that glow softly, and an old brown wool scarf wrapped around his neck. Bram, a burly man about 40 with a scarred jaw, wet curly red-brown hair and a thick matted red-brown beard, wearing a heavy, shaggy, knee-length coat of worn brown and tan sheepskin fleece with a wide fleece collar, over a stained brown wool tunic with a wide leather belt, rough brown wool trousers and tall worn brown leather boots. VISIBLE STATE, must be clearly shown: the glow in his jaws, no fire released. Everyone is turned three-quarters toward the camera so every face is visible; nobody has their back to the camera and nobody looks into the lens. All mouths closed. Setting: the main lane of Kelvhaven: low grey fieldstone cottages with thick green turf roofs, weathered wooden doors and shutters, a muddy cobbled lane sloping down toward the harbor. Early winter chill: a bitter wind, cold drizzle and sea mist, wet stone and mud, faint breath vapor in the cold air; no snow and no ice anywhere. [AESTHETIC STYLE] Photorealistic, shallow depth of field with cinematic bokeh, cinematic film still, dark fantasy, fine film grain, high-fidelity textures, desaturated high-contrast color grade, professional movie look. Palette: storm slate grey, fog grey, driftwood brown and wet-wool grey, with orange torchlight against cold blue. No text, no watermark, no modern objects.</w:t>
       </w:r>
     </w:p>
     <w:p>
@@ -2722,7 +2722,7 @@
         <w:t xml:space="preserve">Video prompt (10 s):</w:t>
       </w:r>
       <w:r>
-        <w:t xml:space="preserve"> 10-second cinematic shot, 16:9, photorealistic dark fantasy, desaturated high-contrast grade, animate from the uploaded image. 0–7s: the glow grows to its brightest; Tal draws a deep breath; Bram shields his face with his arm. 7–10s: hold on the moment before the fire. RULES: no one speaks; no dialogue. Nobody looks into the camera lens and nobody turns their back to the camera. Camera: completely static, locked off on a tripod; no zoom; all motion comes from the characters, the wind, the water and the light. Early winter chill: wind tugs at hair and cloaks, light drizzle, breath vapor; no snow, no ice. Lighting stays: orange pitch-torch light flickering against cold blue darkness, drifting harbor fog, volumetric torchlight haze, Rembrandt lighting sculpting the faces; faces are lit only by the nearest flame or glow and everything beyond it falls into black; no daylight anywhere. The torches are wooden staves with rag heads soaked in fish oil and pitch. Mood: terror. Sound: a deep rumbling breath, crackling heat. Keep every face, costume and the dragon's design exactly as in the image; Tal stays horse-sized and blush-pink with violet eyes and his brown wool scarf; smooth, natural, physically real motion; no on-screen text.</w:t>
+        <w:t xml:space="preserve"> 10-second cinematic shot, 16:9, photorealistic dark fantasy, desaturated high-contrast grade, animate from the uploaded image. 0–7s: the glow grows to its brightest; Tal draws a long, deep breath, his chest swelling; Bram's terrified face is lit orange. 7–10s: hold on the moment before the fire. RULES: no spoken lines; only wordless shouts, war cries, grunts and roars. Nobody looks into the camera lens and nobody turns their back to the camera. Camera: dynamic action camera, like a big-budget dragon battle film: handheld with a slight combat shake, a slow push-in from Bram's eye level up into the glowing jaws; the impact of each roar and blow shakes the camera; no cuts. Early winter chill: wind tugs at hair and cloaks, light drizzle, breath vapor; no snow, no ice. Lighting stays: orange pitch-torch light flickering against cold blue darkness, drifting harbor fog, volumetric torchlight haze, Rembrandt lighting sculpting the faces; faces are lit only by the nearest flame or glow and everything beyond it falls into black; no daylight anywhere. The torches are wooden staves with rag heads soaked in fish oil and pitch. Mood: terror. Sound: a deep rumbling breath, crackling heat, Bram's ragged breathing. PERFORMANCE: everyone acts with real intensity: the villagers shout, snarl and fight like warriors defending their homes; Tal fights like a furious dragon (snarling, snapping, roaring with spit flying, crest flared, wings mantled, tail lashing). Keep every face, costume and the dragon's design exactly as in the image; Tal stays horse-sized and blush-pink with violet eyes and his brown wool scarf; smooth, natural, physically real motion; no on-screen text.</w:t>
       </w:r>
     </w:p>
     <w:p>
@@ -3200,7 +3200,7 @@
         <w:t xml:space="preserve">Image prompt:</w:t>
       </w:r>
       <w:r>
-        <w:t xml:space="preserve"> [ASPECT RATIO] 16:9 cinematic widescreen. [FRAMING &amp; LENS] WIDE SHOT at eye level, 35mm anamorphic lens, cinematic framing, nothing cut off at the top or bottom; the characters are small in the frame, seen full-length from head to toe, each figure no taller than about one third of the frame height, with the setting filling most of the picture. [LIGHTING] Cinematic lighting at TRUE NIGHT under a black sky: orange pitch-torch light flickering against cold blue darkness, drifting harbor fog, volumetric torchlight haze, Rembrandt lighting sculpting the faces; faces are lit only by the nearest flame or glow and everything beyond it falls into black; no daylight anywhere. The torches are wooden staves with rag heads soaked in fish oil and pitch. [SUBJECT &amp; ACTION] Tal pressing his shoulder against the barred shed door, the thick wooden beam bending. CHARACTERS (keep exactly as described): Tal, a fully grown adult sea dragon only about 6 feet (1.8 m) tall at the head, the size of a horse, not giant and not towering: standing on all four legs his head is level with a grown woman's head, and his body is about as long as a horse; slender and strong, with blush-pink and rose-white scales with a soft pearly sheen, large pale pink bat-like wings with faint violet veins, a crest of sharp spiky pink-white fin-frills on his head and neck, violet slit-pupil eyes, faint violet veins that glow softly, and an old brown wool scarf wrapped around his neck. VISIBLE STATE, must be clearly shown: the beam bending but not yet broken. Everyone is turned three-quarters toward the camera so every face is visible; nobody has their back to the camera and nobody looks into the lens. All mouths closed. Setting: Bram's old fishing shed on the harbor front: weathered black tarred plank walls with thin gaps between the boards, a heavy plank door barred with a thick wooden beam, old nets, cork floats and oars hanging on the outside wall, the harbor behind. Early winter chill: a bitter wind, cold drizzle and sea mist, wet stone and mud, faint breath vapor in the cold air; no snow and no ice anywhere. [AESTHETIC STYLE] Photorealistic, shallow depth of field with cinematic bokeh, cinematic film still, dark fantasy, fine film grain, high-fidelity textures, desaturated high-contrast color grade, professional movie look. Palette: storm slate grey, fog grey, driftwood brown and wet-wool grey, with orange torchlight against cold blue. No text, no watermark, no modern objects.</w:t>
+        <w:t xml:space="preserve"> [ASPECT RATIO] 16:9 cinematic widescreen. [FRAMING &amp; LENS] WIDE SHOT from a low angle, 35mm anamorphic lens, cinematic framing, nothing cut off at the top or bottom; the characters are small in the frame, seen full-length from head to toe, each figure no taller than about one third of the frame height, with the setting filling most of the picture. [LIGHTING] Cinematic lighting at TRUE NIGHT under a black sky: orange pitch-torch light flickering against cold blue darkness, drifting harbor fog, volumetric torchlight haze, Rembrandt lighting sculpting the faces; faces are lit only by the nearest flame or glow and everything beyond it falls into black; no daylight anywhere. The torches are wooden staves with rag heads soaked in fish oil and pitch. [SUBJECT &amp; ACTION] Tal ramming his shoulder against the barred shed door, the thick wooden beam bending, his claws gouging the ground. The dragon: Tal in full fury, like a dragon in a great adventure film: snarling with his lips pulled back over rows of sharp white teeth, nostrils flared and steaming, his spiky pink-white crest raised and fanned out, wings mantled wide and high to make himself bigger, every muscle tense, claws gouging the ground, tail lashing, violet veins blazing bright, violet eyes narrowed to slits with rage. CHARACTERS (keep exactly as described): Tal, a fully grown adult sea dragon only about 6 feet (1.8 m) tall at the head, the size of a horse, not giant and not towering: standing on all four legs his head is level with a grown woman's head, and his body is about as long as a horse; slender and strong, with blush-pink and rose-white scales with a soft pearly sheen, large pale pink bat-like wings with faint violet veins, a crest of sharp spiky pink-white fin-frills on his head and neck, violet slit-pupil eyes, faint violet veins that glow softly, and an old brown wool scarf wrapped around his neck. VISIBLE STATE, must be clearly shown: the beam bending but not yet broken. Everyone is turned three-quarters toward the camera so every face is visible; nobody has their back to the camera and nobody looks into the lens. All mouths closed. Setting: Bram's old fishing shed on the harbor front: weathered black tarred plank walls with thin gaps between the boards, a heavy plank door barred with a thick wooden beam, old nets, cork floats and oars hanging on the outside wall, the harbor behind. Early winter chill: a bitter wind, cold drizzle and sea mist, wet stone and mud, faint breath vapor in the cold air; no snow and no ice anywhere. [AESTHETIC STYLE] Photorealistic, shallow depth of field with cinematic bokeh, cinematic film still, dark fantasy, fine film grain, high-fidelity textures, desaturated high-contrast color grade, professional movie look. Palette: storm slate grey, fog grey, driftwood brown and wet-wool grey, with orange torchlight against cold blue. No text, no watermark, no modern objects.</w:t>
       </w:r>
     </w:p>
     <w:p>
@@ -3220,7 +3220,7 @@
         <w:t xml:space="preserve">Video prompt (10 s):</w:t>
       </w:r>
       <w:r>
-        <w:t xml:space="preserve"> 10-second cinematic shot, 16:9, photorealistic dark fantasy, desaturated high-contrast grade, animate from the uploaded image. 0–10s: Tal growls low and pushes harder; the beam creaks and splinters start to crack. RULES: no one speaks; no dialogue. Nobody looks into the camera lens and nobody turns their back to the camera. Camera: completely static, locked off on a tripod; no zoom; all motion comes from the characters, the wind, the water and the light. Early winter chill: wind tugs at hair and cloaks, light drizzle, breath vapor; no snow, no ice. Lighting stays: orange pitch-torch light flickering against cold blue darkness, drifting harbor fog, volumetric torchlight haze, Rembrandt lighting sculpting the faces; faces are lit only by the nearest flame or glow and everything beyond it falls into black; no daylight anywhere. The torches are wooden staves with rag heads soaked in fish oil and pitch. Mood: tension. Sound: a low growl, creaking wood. Keep every face, costume and the dragon's design exactly as in the image; Tal stays horse-sized and blush-pink with violet eyes and his brown wool scarf; smooth, natural, physically real motion; no on-screen text.</w:t>
+        <w:t xml:space="preserve"> 10-second cinematic shot, 16:9, photorealistic dark fantasy, desaturated high-contrast grade, animate from the uploaded image. 0–10s: Tal snarls and rams the door again and again; the beam creaks and splinters crack; dust shakes from the roof. RULES: no spoken lines; only wordless shouts, war cries, grunts and roars. Nobody looks into the camera lens and nobody turns their back to the camera. Camera: dynamic action camera, like a big-budget dragon battle film: handheld with a slight combat shake, a low angle shaking with each impact; the impact of each roar and blow shakes the camera; no cuts. Early winter chill: wind tugs at hair and cloaks, light drizzle, breath vapor; no snow, no ice. Lighting stays: orange pitch-torch light flickering against cold blue darkness, drifting harbor fog, volumetric torchlight haze, Rembrandt lighting sculpting the faces; faces are lit only by the nearest flame or glow and everything beyond it falls into black; no daylight anywhere. The torches are wooden staves with rag heads soaked in fish oil and pitch. Mood: fury. Sound: slamming wood, splintering, a snarl. PERFORMANCE: everyone acts with real intensity: the villagers shout, snarl and fight like warriors defending their homes; Tal fights like a furious dragon (snarling, snapping, roaring with spit flying, crest flared, wings mantled, tail lashing). Keep every face, costume and the dragon's design exactly as in the image; Tal stays horse-sized and blush-pink with violet eyes and his brown wool scarf; smooth, natural, physically real motion; no on-screen text.</w:t>
       </w:r>
     </w:p>
     <w:p>
@@ -3396,7 +3396,7 @@
         <w:t xml:space="preserve">Image prompt:</w:t>
       </w:r>
       <w:r>
-        <w:t xml:space="preserve"> [ASPECT RATIO] 16:9 cinematic widescreen. [FRAMING &amp; LENS] WIDE SHOT from a low angle, 35mm anamorphic lens, cinematic framing, nothing cut off at the top or bottom; the characters are small in the frame, seen full-length from head to toe, each figure no taller than about one third of the frame height, with the setting filling most of the picture. [LIGHTING] Cinematic lighting at TRUE NIGHT under a black sky: orange pitch-torch light flickering against cold blue darkness, drifting harbor fog, volumetric torchlight haze, Rembrandt lighting sculpting the faces; faces are lit only by the nearest flame or glow and everything beyond it falls into black; no daylight anywhere. The torches are wooden staves with rag heads soaked in fish oil and pitch. [SUBJECT &amp; ACTION] On the LEFT, Bram back on his feet with a new harpoon, with a group of villagers holding torches and gaffs; on the RIGHT, about 10 meters away, Tal beside the shed, turned toward them. CHARACTERS (keep exactly as described): Bram, a burly man about 40 with a scarred jaw, wet curly red-brown hair and a thick matted red-brown beard, wearing a heavy, shaggy, knee-length coat of worn brown and tan sheepskin fleece with a wide fleece collar, over a stained brown wool tunic with a wide leather belt, rough brown wool trousers and tall worn brown leather boots. villagers in real, everyday medieval northern fishing-village clothing in many different natural colours, every person dressed differently: layered hand-woven wool tunics, kirtles and hooded cloaks in undyed cream, oatmeal and sheep-grey, walnut brown, faded woad blue, mustard ochre and rust brown, with sheepskin vests, oiled leather jerkins, oilskin capes, wool hoods and caps, leather belts, leg-wraps and worn leather shoes; all colours muted, earthy and weathered, nothing bright; people of different heights and builds, faces under their hoods half in shadow. Tal, a fully grown adult sea dragon only about 6 feet (1.8 m) tall at the head, the size of a horse, not giant and not towering: standing on all four legs his head is level with a grown woman's head, and his body is about as long as a horse; slender and strong, with blush-pink and rose-white scales with a soft pearly sheen, large pale pink bat-like wings with faint violet veins, a crest of sharp spiky pink-white fin-frills on his head and neck, violet slit-pupil eyes, faint violet veins that glow softly, and an old brown wool scarf wrapped around his neck. Everyone is turned three-quarters toward the camera so every face is visible; nobody has their back to the camera and nobody looks into the lens. All mouths closed. Setting: Bram's old fishing shed on the harbor front: weathered black tarred plank walls with thin gaps between the boards, a heavy plank door barred with a thick wooden beam, old nets, cork floats and oars hanging on the outside wall, the harbor behind. Early winter chill: a bitter wind, cold drizzle and sea mist, wet stone and mud, faint breath vapor in the cold air; no snow and no ice anywhere. [AESTHETIC STYLE] Photorealistic, shallow depth of field with cinematic bokeh, cinematic film still, dark fantasy, fine film grain, high-fidelity textures, desaturated high-contrast color grade, professional movie look. Palette: storm slate grey, fog grey, driftwood brown and wet-wool grey, with orange torchlight against cold blue. No text, no watermark, no modern objects.</w:t>
+        <w:t xml:space="preserve"> [ASPECT RATIO] 16:9 cinematic widescreen. [FRAMING &amp; LENS] WIDE SHOT from a low angle, 35mm anamorphic lens, cinematic framing, nothing cut off at the top or bottom; the characters are small in the frame, seen full-length from head to toe, each figure no taller than about one third of the frame height, with the setting filling most of the picture. [LIGHTING] Cinematic lighting at TRUE NIGHT under a black sky: orange pitch-torch light flickering against cold blue darkness, drifting harbor fog, volumetric torchlight haze, Rembrandt lighting sculpting the faces; faces are lit only by the nearest flame or glow and everything beyond it falls into black; no daylight anywhere. The torches are wooden staves with rag heads soaked in fish oil and pitch. [SUBJECT &amp; ACTION] On the LEFT, Bram back on his feet with a new harpoon, leading a line of villagers with torches, gaffs and shields, all advancing; on the RIGHT, about 10 meters away, Tal beside the shed, turning on them with a snarl. The villagers: the villagers as fierce, angry fighters, not bystanders: teeth bared, brows furrowed, faces twisted with rage and fear, mouths open in war cries, crouched in fighting stances, gripping spears, harpoons, gaffs and boat-hook poles, some holding round wooden shields and broken boat planks as cover, cloaks whipping, mud on their legs. The dragon: Tal in full fury, like a dragon in a great adventure film: snarling with his lips pulled back over rows of sharp white teeth, nostrils flared and steaming, his spiky pink-white crest raised and fanned out, wings mantled wide and high to make himself bigger, every muscle tense, claws gouging the ground, tail lashing, violet veins blazing bright, violet eyes narrowed to slits with rage. CHARACTERS (keep exactly as described): Bram, a burly man about 40 with a scarred jaw, wet curly red-brown hair and a thick matted red-brown beard, wearing a heavy, shaggy, knee-length coat of worn brown and tan sheepskin fleece with a wide fleece collar, over a stained brown wool tunic with a wide leather belt, rough brown wool trousers and tall worn brown leather boots. villagers in real, everyday medieval northern fishing-village clothing in many different natural colours, every person dressed differently: layered hand-woven wool tunics, kirtles and hooded cloaks in undyed cream, oatmeal and sheep-grey, walnut brown, faded woad blue, mustard ochre and rust brown, with sheepskin vests, oiled leather jerkins, oilskin capes, wool hoods and caps, leather belts, leg-wraps and worn leather shoes; all colours muted, earthy and weathered, nothing bright; people of different heights and builds, faces under their hoods half in shadow. Tal, a fully grown adult sea dragon only about 6 feet (1.8 m) tall at the head, the size of a horse, not giant and not towering: standing on all four legs his head is level with a grown woman's head, and his body is about as long as a horse; slender and strong, with blush-pink and rose-white scales with a soft pearly sheen, large pale pink bat-like wings with faint violet veins, a crest of sharp spiky pink-white fin-frills on his head and neck, violet slit-pupil eyes, faint violet veins that glow softly, and an old brown wool scarf wrapped around his neck. Everyone is turned three-quarters toward the camera so every face is visible; nobody has their back to the camera and nobody looks into the lens. All mouths closed. Setting: Bram's old fishing shed on the harbor front: weathered black tarred plank walls with thin gaps between the boards, a heavy plank door barred with a thick wooden beam, old nets, cork floats and oars hanging on the outside wall, the harbor behind. Early winter chill: a bitter wind, cold drizzle and sea mist, wet stone and mud, faint breath vapor in the cold air; no snow and no ice anywhere. [AESTHETIC STYLE] Photorealistic, shallow depth of field with cinematic bokeh, cinematic film still, dark fantasy, fine film grain, high-fidelity textures, desaturated high-contrast color grade, professional movie look. Palette: storm slate grey, fog grey, driftwood brown and wet-wool grey, with orange torchlight against cold blue. No text, no watermark, no modern objects.</w:t>
       </w:r>
     </w:p>
     <w:p>
@@ -3416,7 +3416,7 @@
         <w:t xml:space="preserve">Video prompt (10 s):</w:t>
       </w:r>
       <w:r>
-        <w:t xml:space="preserve"> 10-second cinematic shot, 16:9, photorealistic dark fantasy, desaturated high-contrast grade, animate from the uploaded image. 0–10s: the men edge forward together, harpoons raised; Tal looks at them, then back at the shed door. RULES: no one speaks; no dialogue. Nobody looks into the camera lens and nobody turns their back to the camera. Camera: completely static, locked off on a tripod; no zoom; all motion comes from the characters, the wind, the water and the light. Early winter chill: wind tugs at hair and cloaks, light drizzle, breath vapor; no snow, no ice. Lighting stays: orange pitch-torch light flickering against cold blue darkness, drifting harbor fog, volumetric torchlight haze, Rembrandt lighting sculpting the faces; faces are lit only by the nearest flame or glow and everything beyond it falls into black; no daylight anywhere. The torches are wooden staves with rag heads soaked in fish oil and pitch. Mood: tension. Sound: crackling pitch torches, wind, waves slapping the jetty. Keep every face, costume and the dragon's design exactly as in the image; Tal stays horse-sized and blush-pink with violet eyes and his brown wool scarf; smooth, natural, physically real motion; no on-screen text.</w:t>
+        <w:t xml:space="preserve"> 10-second cinematic shot, 16:9, photorealistic dark fantasy, desaturated high-contrast grade, animate from the uploaded image. 0–5s: the men advance step by step, banging their weapons on their shields and shouting. 5–10s: Tal turns on them, wings mantled, and roars; they halt, braced; Tal glances back at the shed door, torn. RULES: no spoken lines; only wordless shouts, war cries, grunts and roars. Nobody looks into the camera lens and nobody turns their back to the camera. Camera: dynamic action camera, like a big-budget dragon battle film: handheld with a slight combat shake, a slow push from behind the dragon's flank along the side of the line, then a quick tilt to Tal's face; the impact of each roar and blow shakes the camera; no cuts. Early winter chill: wind tugs at hair and cloaks, light drizzle, breath vapor; no snow, no ice. Lighting stays: orange pitch-torch light flickering against cold blue darkness, drifting harbor fog, volumetric torchlight haze, Rembrandt lighting sculpting the faces; faces are lit only by the nearest flame or glow and everything beyond it falls into black; no daylight anywhere. The torches are wooden staves with rag heads soaked in fish oil and pitch. Mood: fury. Sound: weapons banging on shields, a war chant, a roar. PERFORMANCE: everyone acts with real intensity: the villagers shout, snarl and fight like warriors defending their homes; Tal fights like a furious dragon (snarling, snapping, roaring with spit flying, crest flared, wings mantled, tail lashing). Keep every face, costume and the dragon's design exactly as in the image; Tal stays horse-sized and blush-pink with violet eyes and his brown wool scarf; smooth, natural, physically real motion; no on-screen text.</w:t>
       </w:r>
     </w:p>
     <w:p>
@@ -3600,7 +3600,7 @@
         <w:t xml:space="preserve">Image prompt:</w:t>
       </w:r>
       <w:r>
-        <w:t xml:space="preserve"> [ASPECT RATIO] 16:9 cinematic widescreen. [FRAMING &amp; LENS] WIDE SHOT side view, 35mm anamorphic lens, cinematic framing, nothing cut off at the top or bottom; the characters are small in the frame, seen full-length from head to toe, each figure no taller than about one third of the frame height, with the setting filling most of the picture. [LIGHTING] Cinematic lighting at TRUE NIGHT under a black sky: orange pitch-torch light flickering against cold blue darkness, drifting harbor fog, volumetric torchlight haze, Rembrandt lighting sculpting the faces; faces are lit only by the nearest flame or glow and everything beyond it falls into black; no daylight anywhere. The torches are wooden staves with rag heads soaked in fish oil and pitch. [SUBJECT &amp; ACTION] Tal sliding off the end of the broken jetty into the black harbor, half in the water, seen from the side so his face is visible. CHARACTERS (keep exactly as described): Tal, a fully grown adult sea dragon only about 6 feet (1.8 m) tall at the head, the size of a horse, not giant and not towering: standing on all four legs his head is level with a grown woman's head, and his body is about as long as a horse; slender and strong, with blush-pink and rose-white scales with a soft pearly sheen, large pale pink bat-like wings with faint violet veins, a crest of sharp spiky pink-white fin-frills on his head and neck, violet slit-pupil eyes, faint violet veins that glow softly, and an old brown wool scarf wrapped around his neck. Everyone is turned three-quarters toward the camera so every face is visible; nobody has their back to the camera and nobody looks into the lens. All mouths closed. Setting: the harbor of Kelvhaven, a medieval northern fishing village: an old wooden jetty on rough stone piers, wooden fishing boats moored on the black water, a square grey stone bell tower with a bronze bell at the harbor edge, wet stones, coils of rope, barrels and lobster pots. Early winter chill: a bitter wind, cold drizzle and sea mist, wet stone and mud, faint breath vapor in the cold air; no snow and no ice anywhere. [AESTHETIC STYLE] Photorealistic, shallow depth of field with cinematic bokeh, cinematic film still, dark fantasy, fine film grain, high-fidelity textures, desaturated high-contrast color grade, professional movie look. Palette: storm slate grey, fog grey, driftwood brown and wet-wool grey, with orange torchlight against cold blue. No text, no watermark, no modern objects.</w:t>
+        <w:t xml:space="preserve"> [ASPECT RATIO] 16:9 cinematic widescreen. [FRAMING &amp; LENS] WIDE SHOT side view, low angle, 35mm anamorphic lens, cinematic framing, nothing cut off at the top or bottom; the characters are small in the frame, seen full-length from head to toe, each figure no taller than about one third of the frame height, with the setting filling most of the picture. [LIGHTING] Cinematic lighting at TRUE NIGHT under a black sky: orange pitch-torch light flickering against cold blue darkness, drifting harbor fog, volumetric torchlight haze, Rembrandt lighting sculpting the faces; faces are lit only by the nearest flame or glow and everything beyond it falls into black; no daylight anywhere. The torches are wooden staves with rag heads soaked in fish oil and pitch. [SUBJECT &amp; ACTION] Tal leaping off the end of the broken jetty toward the black harbor, wings half folded, harpoons flying past him from men on the LEFT. The dragon: Tal in full fury, like a dragon in a great adventure film: snarling with his lips pulled back over rows of sharp white teeth, nostrils flared and steaming, his spiky pink-white crest raised and fanned out, wings mantled wide and high to make himself bigger, every muscle tense, claws gouging the ground, tail lashing, violet veins blazing bright, violet eyes narrowed to slits with rage. CHARACTERS (keep exactly as described): Tal, a fully grown adult sea dragon only about 6 feet (1.8 m) tall at the head, the size of a horse, not giant and not towering: standing on all four legs his head is level with a grown woman's head, and his body is about as long as a horse; slender and strong, with blush-pink and rose-white scales with a soft pearly sheen, large pale pink bat-like wings with faint violet veins, a crest of sharp spiky pink-white fin-frills on his head and neck, violet slit-pupil eyes, faint violet veins that glow softly, and an old brown wool scarf wrapped around his neck. villagers in real, everyday medieval northern fishing-village clothing in many different natural colours, every person dressed differently: layered hand-woven wool tunics, kirtles and hooded cloaks in undyed cream, oatmeal and sheep-grey, walnut brown, faded woad blue, mustard ochre and rust brown, with sheepskin vests, oiled leather jerkins, oilskin capes, wool hoods and caps, leather belts, leg-wraps and worn leather shoes; all colours muted, earthy and weathered, nothing bright; people of different heights and builds, faces under their hoods half in shadow. Everyone is turned three-quarters toward the camera so every face is visible; nobody has their back to the camera and nobody looks into the lens. All mouths closed. Setting: the harbor of Kelvhaven, a medieval northern fishing village: an old wooden jetty on rough stone piers, wooden fishing boats moored on the black water, a square grey stone bell tower with a bronze bell at the harbor edge, wet stones, coils of rope, barrels and lobster pots. Early winter chill: a bitter wind, cold drizzle and sea mist, wet stone and mud, faint breath vapor in the cold air; no snow and no ice anywhere. [AESTHETIC STYLE] Photorealistic, shallow depth of field with cinematic bokeh, cinematic film still, dark fantasy, fine film grain, high-fidelity textures, desaturated high-contrast color grade, professional movie look. Palette: storm slate grey, fog grey, driftwood brown and wet-wool grey, with orange torchlight against cold blue. No text, no watermark, no modern objects.</w:t>
       </w:r>
     </w:p>
     <w:p>
@@ -3620,7 +3620,7 @@
         <w:t xml:space="preserve">Video prompt (10 s):</w:t>
       </w:r>
       <w:r>
-        <w:t xml:space="preserve"> 10-second cinematic shot, 16:9, photorealistic dark fantasy, desaturated high-contrast grade, animate from the uploaded image. 0–6s: Tal slips under the water. 6–10s: a late harpoon splashes harmlessly behind him; the ripples spread. RULES: no one speaks; no dialogue. Nobody looks into the camera lens and nobody turns their back to the camera. Camera: completely static, locked off on a tripod; no zoom; all motion comes from the characters, the wind, the water and the light. Early winter chill: wind tugs at hair and cloaks, light drizzle, breath vapor; no snow, no ice. Lighting stays: orange pitch-torch light flickering against cold blue darkness, drifting harbor fog, volumetric torchlight haze, Rembrandt lighting sculpting the faces; faces are lit only by the nearest flame or glow and everything beyond it falls into black; no daylight anywhere. The torches are wooden staves with rag heads soaked in fish oil and pitch. Mood: loss. Sound: a heavy splash, ripples, distant shouts. Keep every face, costume and the dragon's design exactly as in the image; Tal stays horse-sized and blush-pink with violet eyes and his brown wool scarf; smooth, natural, physically real motion; no on-screen text.</w:t>
+        <w:t xml:space="preserve"> 10-second cinematic shot, 16:9, photorealistic dark fantasy, desaturated high-contrast grade, animate from the uploaded image. 0–5s: Tal dives into the black water with a huge splash. 5–10s: harpoons splash harmlessly behind him; the men run to the edge, shouting and pointing. RULES: no spoken lines; only wordless shouts, war cries, grunts and roars. Nobody looks into the camera lens and nobody turns their back to the camera. Camera: dynamic action camera, like a big-budget dragon battle film: handheld with a slight combat shake, tracking alongside him, then a fast tilt down into the splash; the impact of each roar and blow shakes the camera; no cuts. Early winter chill: wind tugs at hair and cloaks, light drizzle, breath vapor; no snow, no ice. Lighting stays: orange pitch-torch light flickering against cold blue darkness, drifting harbor fog, volumetric torchlight haze, Rembrandt lighting sculpting the faces; faces are lit only by the nearest flame or glow and everything beyond it falls into black; no daylight anywhere. The torches are wooden staves with rag heads soaked in fish oil and pitch. Mood: fury. Sound: a huge splash, harpoons hitting water, shouts. PERFORMANCE: everyone acts with real intensity: the villagers shout, snarl and fight like warriors defending their homes; Tal fights like a furious dragon (snarling, snapping, roaring with spit flying, crest flared, wings mantled, tail lashing). Keep every face, costume and the dragon's design exactly as in the image; Tal stays horse-sized and blush-pink with violet eyes and his brown wool scarf; smooth, natural, physically real motion; no on-screen text.</w:t>
       </w:r>
     </w:p>
     <w:p>

</xml_diff>